<commit_message>
Aplicar correcciones de Jonathan, avales, ampliación USD y modificación de amortización
Co-Authored-By: Claude Opus 5.5 <noreply@anthropic.com>
Claude-Session: https://claude.ai/code/session_01JR48ZtjHAJWp3RfTGUyHxs
</commit_message>
<xml_diff>
--- a/Informe_Nueva_Aplicacion_Gestion_Middle_Office.docx
+++ b/Informe_Nueva_Aplicacion_Gestion_Middle_Office.docx
@@ -111,7 +111,7 @@
           <w:sz w:val="22"/>
           <w:szCs w:val="22"/>
         </w:rPr>
-        <w:t xml:space="preserve">Fecha: 13 de octubre de 2026</w:t>
+        <w:t xml:space="preserve">Fecha: 14 de octubre de 2026</w:t>
       </w:r>
     </w:p>
     <w:p>
@@ -218,7 +218,7 @@
           <w:sz w:val="21"/>
           <w:szCs w:val="21"/>
         </w:rPr>
-        <w:t xml:space="preserve">Hoy la aprobación y la carga de una línea de crédito dependen de tareas manuales. La minuta que se lleva al comité se arma a mano en Riesgos. Una vez que el comité la aprueba, Riesgo de Crédito vuelve a cargar la misma información en COBIS Trámites. Esa carga no termina ahí: recorre cuatro instancias más de control y aprobación (la verificación de la carga, el gerente comercial, el gerente de Riesgos y el CEO), que en la práctica confirman una decisión que el comité ya había tomado.</w:t>
+        <w:t xml:space="preserve">Hoy la aprobación y la carga de una línea de crédito dependen de tareas manuales. La minuta que se lleva al comité se arma a mano en Riesgos. Una vez que el comité la aprueba, Middle Office vuelve a cargar la misma información en COBIS Trámites. Esa carga no termina ahí: recorre cuatro instancias más de control y aprobación (la verificación de la carga, el gerente comercial, el gerente de Riesgos y el CEO), que en la práctica confirman una decisión que el comité ya había tomado.</w:t>
       </w:r>
     </w:p>
     <w:p>
@@ -381,7 +381,7 @@
           <w:sz w:val="21"/>
           <w:szCs w:val="21"/>
         </w:rPr>
-        <w:t xml:space="preserve">Aprobar el alcance de los diez módulos que se describen en este informe.</w:t>
+        <w:t xml:space="preserve">Aprobar el alcance de los once módulos que se describen en este informe.</w:t>
       </w:r>
     </w:p>
     <w:p>
@@ -482,7 +482,7 @@
           <w:sz w:val="21"/>
           <w:szCs w:val="21"/>
         </w:rPr>
-        <w:t xml:space="preserve">El Comité de Créditos y Negocios se reúne los martes y trata todas las líneas en general. Lo integran el presidente del banco, los directores Mariela Riusetch y Norberto Matis, el gerente de Riesgos, el CEO, Cristian Navarro, y el gerente comercial que corresponda según el cliente, que puede ser Raúl Lynch o Rudecindo Roca. Las sesiones del comité se graban.</w:t>
+        <w:t xml:space="preserve">El Comité de Créditos y Negocios se reúne los martes y trata todas las líneas en general. Lo integran el presidente del banco, los directores Mariela Riusetch y Norberto Mathys, el gerente de Riesgos, el CEO, Cristian Navarro, y el gerente comercial que corresponda según el cliente, que puede ser Raúl Lynch o Rudecindo Roca. Las sesiones del comité se graban.</w:t>
       </w:r>
     </w:p>
     <w:p>
@@ -521,7 +521,7 @@
           <w:sz w:val="21"/>
           <w:szCs w:val="21"/>
         </w:rPr>
-        <w:t xml:space="preserve">A cada comité se llega con una minuta que hoy arma a mano Abril Vázquez, en Riesgos. La minuta informa la línea presente y la línea propuesta, es decir, el monto vigente y el que se somete a aprobación; el rating crediticio del cliente o del grupo; y la fecha de revisión de la entidad. Si durante el comité se modifica la propuesta, la minuta se corrige a mano. Con el nuevo circuito, la minuta sumará dos datos obligatorios: el oficial de la cuenta y el CUIT del cliente.</w:t>
+        <w:t xml:space="preserve">A cada comité se llega con una minuta que hoy arma a mano Abril Vázquez, en Riesgos. La minuta informa la línea presente y la línea propuesta, es decir, el monto vigente y el que se somete a aprobación; el rating crediticio del cliente o del grupo; la situación según el BCRA; y la fecha de revisión de la entidad. Si durante el comité se modifica la propuesta, la minuta se corrige a mano. Con el nuevo circuito, la minuta sumará dos datos obligatorios: el oficial de la cuenta y el CUIT del cliente.</w:t>
       </w:r>
     </w:p>
     <w:p>
@@ -571,7 +571,7 @@
           <w:sz w:val="21"/>
           <w:szCs w:val="21"/>
         </w:rPr>
-        <w:t xml:space="preserve">Con la minuta aprobada, Riesgo de Crédito carga la línea a mano en COBIS Trámites y luego verifica que esa carga coincida con lo que aprobó el comité. A partir de ahí la carga pasa por tres aprobaciones sucesivas: primero la del gerente comercial que corresponda, después la del gerente de Riesgos y por último la del CEO. Recién con esa última aprobación la línea queda disponible para operar. Del lado de Riesgos, el ruteo de las líneas lo realiza Agustín Sotz.</w:t>
+        <w:t xml:space="preserve">Con la minuta aprobada, Riesgo de Crédito envía la minuta por mail a Middle Office, que realiza la carga de la línea a mano en COBIS Trámites. Luego, el analista de Riesgo de Crédito verifica que esa carga coincida con lo que aprobó el comité. A partir de ahí la carga pasa por tres aprobaciones sucesivas: primero la del gerente comercial que corresponda, después la del gerente de Riesgos y por último la del CEO. Recién con esa última aprobación la línea queda disponible para operar.</w:t>
       </w:r>
     </w:p>
     <w:p>
@@ -689,7 +689,7 @@
           <w:sz w:val="21"/>
           <w:szCs w:val="21"/>
         </w:rPr>
-        <w:t xml:space="preserve">Hay además tres problemas puntuales. Cuando el cliente no está en COBIS MIS, hay que darlo de alta antes de poder cargar la línea; el proyecto incorpora un alta simplificada con CUIT, razón social y rating. Las líneas en dólares no se ajustan por tipo de cambio, por lo que su valor en pesos queda desactualizado; el proyecto prevé su actualización automática. Y no existe una vista única de las líneas: para conocer el consumo, el disponible o el vencimiento de una línea hay que buscar en distintos lugares, algo que resuelve la nueva pantalla de líneas.</w:t>
+        <w:t xml:space="preserve">Hay además tres problemas puntuales. Cuando el cliente no está en COBIS MIS, hay que darlo de alta antes de poder cargar la línea; el proyecto incorpora un alta simplificada con CUIT, razón social y rating. Las líneas garantizadas con avales no tienen un circuito propio: los avales, sus avalistas y sus vencimientos se gestionan por fuera y no siempre quedan registrados en las garantías de COBIS; el proyecto incorpora un circuito de avales que termina con su registro automático. Y no existe una vista única de las líneas: para conocer el consumo, el disponible o el vencimiento de una línea hay que buscar en distintos lugares, algo que resuelve la nueva pantalla de líneas.</w:t>
       </w:r>
     </w:p>
     <w:p>
@@ -909,35 +909,35 @@
           <w:sz w:val="21"/>
           <w:szCs w:val="21"/>
         </w:rPr>
-        <w:t xml:space="preserve">El proyecto se organiza en diez módulos, identificados con las letras A a J, que se agrupan en dos bloques.</w:t>
-      </w:r>
-    </w:p>
-    <w:p>
-      <w:pPr>
-        <w:spacing w:after="120"/>
-        <w:jc w:val="both"/>
-      </w:pPr>
-      <w:r>
-        <w:rPr>
-          <w:rFonts w:ascii="Calibri" w:cs="Calibri" w:eastAsia="Calibri" w:hAnsi="Calibri"/>
-          <w:sz w:val="21"/>
-          <w:szCs w:val="21"/>
-        </w:rPr>
-        <w:t xml:space="preserve">El primer bloque es el núcleo del proyecto: la línea de crédito. Lo forman cuatro módulos. El módulo A es la pantalla de minutas y aprobación, un requerimiento nuevo que no surgió del relevamiento, donde se registra la minuta, se guardan sus versiones durante el comité, se aprueba y se disparan las acciones automáticas. El módulo B es el alta de líneas, que incluye la validación contra COBIS MIS, el alta simplificada de clientes y la gestión de garantías por subproducto, con la posibilidad de forzar el alta. El módulo C es la línea en dólares ajustable en pesos, que actualiza la línea general según el tipo de cambio. El módulo D es la pantalla de líneas, también un requerimiento nuevo, que muestra todas las líneas y es el punto de inicio de todas las operaciones.</w:t>
-      </w:r>
-    </w:p>
-    <w:p>
-      <w:pPr>
-        <w:spacing w:after="120"/>
-        <w:jc w:val="both"/>
-      </w:pPr>
-      <w:r>
-        <w:rPr>
-          <w:rFonts w:ascii="Calibri" w:cs="Calibri" w:eastAsia="Calibri" w:hAnsi="Calibri"/>
-          <w:sz w:val="21"/>
-          <w:szCs w:val="21"/>
-        </w:rPr>
-        <w:t xml:space="preserve">El segundo bloque reúne los módulos que se apoyan en la línea activa. El módulo E es el costeo de las operaciones, donde Mesa carga el costo de fondeo por plazo y las tasas mínimas. El módulo F cubre las operaciones de descubierto. El módulo G es la carga de préstamos. El módulo H es el descuento de cheques. El módulo I es la pantalla de vencimientos, que incluye la renovación de descubiertos y la descarga de recibos. El módulo J reúne el seguimiento y los reportes.</w:t>
+        <w:t xml:space="preserve">El proyecto se organiza en once módulos, identificados con las letras A a K, que se agrupan en dos bloques.</w:t>
+      </w:r>
+    </w:p>
+    <w:p>
+      <w:pPr>
+        <w:spacing w:after="120"/>
+        <w:jc w:val="both"/>
+      </w:pPr>
+      <w:r>
+        <w:rPr>
+          <w:rFonts w:ascii="Calibri" w:cs="Calibri" w:eastAsia="Calibri" w:hAnsi="Calibri"/>
+          <w:sz w:val="21"/>
+          <w:szCs w:val="21"/>
+        </w:rPr>
+        <w:t xml:space="preserve">El primer bloque es el núcleo del proyecto: la línea de crédito. Lo forman cuatro módulos. El módulo A es la pantalla de minutas y aprobación, un requerimiento nuevo que no surgió del relevamiento, donde se registra la minuta, se guardan sus versiones durante el comité, se aprueba y se disparan las acciones automáticas. El módulo B es el alta de líneas, que incluye la validación contra COBIS MIS, el alta simplificada de clientes y la gestión de garantías por subproducto, con la posibilidad de forzar el alta. El módulo C es la gestión de avales de las líneas garantizadas, también un requerimiento nuevo, que permite asociar uno o más avales a una línea, cada uno con su avalista y su vencimiento, y registrarlos en las garantías de COBIS. El módulo D es la pantalla de líneas, también un requerimiento nuevo, que muestra todas las líneas, es el punto de inicio de todas las operaciones y permite solicitar la ampliación de las líneas en dólares por actualización del tipo de cambio.</w:t>
+      </w:r>
+    </w:p>
+    <w:p>
+      <w:pPr>
+        <w:spacing w:after="120"/>
+        <w:jc w:val="both"/>
+      </w:pPr>
+      <w:r>
+        <w:rPr>
+          <w:rFonts w:ascii="Calibri" w:cs="Calibri" w:eastAsia="Calibri" w:hAnsi="Calibri"/>
+          <w:sz w:val="21"/>
+          <w:szCs w:val="21"/>
+        </w:rPr>
+        <w:t xml:space="preserve">El segundo bloque reúne los módulos que se apoyan en la línea activa. El módulo E es el costeo de las operaciones, donde Mesa carga el costo de fondeo por plazo y las tasas mínimas. El módulo F cubre las operaciones de descubierto. El módulo G es la carga de préstamos. El módulo H es el descuento de cheques. El módulo I es la pantalla de vencimientos, que incluye la renovación de descubiertos y la descarga de recibos. El módulo J reúne el seguimiento y los reportes. Por último, el módulo K, también nuevo, permite modificar las tablas de amortización de préstamos activos.</w:t>
       </w:r>
     </w:p>
     <w:p>
@@ -1002,7 +1002,7 @@
           <w:sz w:val="21"/>
           <w:szCs w:val="21"/>
         </w:rPr>
-        <w:t xml:space="preserve">La minuta digital reúne los mismos datos que la actual, más los que necesita el nuevo circuito. Riesgos carga el CUIT y la razón social del cliente, que son obligatorios; con el CUIT, el sistema busca el grupo económico en COBIS MIS y, si no lo encuentra, marca al cliente para un alta simplificada. El oficial de la cuenta también es obligatorio, porque define qué gerente comercial interviene en la aprobación. Si el cliente ya tiene una línea, el sistema trae la línea presente desde COBIS. Riesgos completa la línea propuesta, con su monto, su moneda, sus subproductos y la indicación de si es una línea en dólares ajustable en pesos; el rating crediticio y la fecha de revisión; y las garantías, indicando qué subproductos las requieren y de qué tipo. Con esa información, el sistema sugiere si la minuta debe ir al comité de los martes o al subcomité de los viernes.</w:t>
+        <w:t xml:space="preserve">La minuta digital reúne los mismos datos que la actual, más los que necesita el nuevo circuito. Riesgos carga el CUIT y la razón social del cliente, que son obligatorios; con el CUIT, el sistema busca el grupo económico en COBIS MIS y, si no lo encuentra, marca al cliente para un alta simplificada. Además, el sistema consulta Nosis y verifica que la situación del cliente sea 1. El oficial de la cuenta también es obligatorio, porque define qué gerente comercial interviene en la aprobación. Si el cliente ya tiene una línea, el sistema trae la línea presente desde COBIS. Riesgos completa la línea propuesta, con su monto, su moneda y sus subproductos; el rating crediticio, la situación según el BCRA y la fecha de revisión; y las garantías, indicando qué subproductos las requieren, de qué tipo y si la línea se garantiza con avales. Con esa información, el sistema sugiere si la minuta debe ir al comité de los martes o al subcomité de los viernes.</w:t>
       </w:r>
     </w:p>
     <w:p>
@@ -1083,7 +1083,7 @@
           <w:sz w:val="21"/>
           <w:szCs w:val="21"/>
         </w:rPr>
-        <w:t xml:space="preserve">La aprobación también registra quién aprobó por el lado comercial, según el oficial de la minuta. En el caso del subcomité, envía la minuta al CEO para su firma por DocuSign y archiva el documento firmado junto con la minuta. Si la línea se aprobó en dólares ajustable en pesos, activa su actualización por tipo de cambio. Avisa a Middle Office, a Riesgo de Crédito, al oficial y al gerente comercial cuando se aprueba la minuta y cuando se completa cada acción. Cuando la línea queda activa, la publica en la pantalla de líneas para que se pueda operar. Y en todos los casos deja un registro de auditoría con quién aprobó, cuándo, qué versión y qué acciones se ejecutaron o fallaron.</w:t>
+        <w:t xml:space="preserve">La aprobación también registra quién aprobó por el lado comercial, según el oficial de la minuta. En el caso del subcomité, envía la minuta al CEO para su firma por DocuSign y archiva el documento firmado junto con la minuta. Si la línea se garantiza con avales, envía a Middle Office la tarea de detallar los avales (módulo C). Avisa a Middle Office, a Riesgo de Crédito, al oficial y al gerente comercial cuando se aprueba la minuta y cuando se completa cada acción. Cuando la línea queda activa, la publica en la pantalla de líneas para que se pueda operar. Y en todos los casos deja un registro de auditoría con quién aprobó, cuándo, qué versión y qué acciones se ejecutaron o fallaron.</w:t>
       </w:r>
     </w:p>
     <w:p>
@@ -1164,7 +1164,7 @@
           <w:sz w:val="21"/>
           <w:szCs w:val="21"/>
         </w:rPr>
-        <w:t xml:space="preserve">La diferencia con el circuito actual es sustancial. Hoy Riesgo de Crédito tipea la línea a partir de la minuta; con el proyecto, la línea se genera desde la minuta aprobada. Hoy se verifica que la carga coincida con lo aprobado; con el proyecto, ese control deja de ser necesario porque los datos vienen de la misma minuta. Hoy hay tres aprobaciones posteriores al comité; con el proyecto, la aprobación del comité queda registrada en la minuta y es suficiente. Y hoy las garantías y las excepciones se manejan por fuera; con el proyecto, solo quedan pendientes los subproductos con garantía y cada forzado queda auditado.</w:t>
+        <w:t xml:space="preserve">La diferencia con el circuito actual es sustancial. Hoy Middle Office tipea la línea a partir de la minuta; con el proyecto, la línea se genera desde la minuta aprobada. Hoy se verifica que la carga coincida con lo aprobado; con el proyecto, ese control deja de ser necesario porque los datos vienen de la misma minuta. Hoy hay tres aprobaciones posteriores al comité; con el proyecto, la aprobación del comité queda registrada en la minuta y es suficiente. Y hoy las garantías y las excepciones se manejan por fuera; con el proyecto, solo quedan pendientes los subproductos con garantía y cada forzado queda auditado.</w:t>
       </w:r>
     </w:p>
     <w:p>
@@ -1175,49 +1175,77 @@
         <w:rPr>
           <w:rFonts w:ascii="Calibri" w:cs="Calibri" w:eastAsia="Calibri" w:hAnsi="Calibri"/>
         </w:rPr>
-        <w:t xml:space="preserve">Módulo C · Línea en dólares ajustable en pesos</w:t>
-      </w:r>
-    </w:p>
-    <w:p>
-      <w:pPr>
-        <w:spacing w:after="120"/>
-        <w:jc w:val="both"/>
-      </w:pPr>
-      <w:r>
-        <w:rPr>
-          <w:rFonts w:ascii="Calibri" w:cs="Calibri" w:eastAsia="Calibri" w:hAnsi="Calibri"/>
-          <w:sz w:val="21"/>
-          <w:szCs w:val="21"/>
-        </w:rPr>
-        <w:t xml:space="preserve">Hay líneas que se aprueban en dólares pero se consumen en pesos. El objetivo de este módulo es que esas líneas se actualicen según el tipo de cambio, para que el consumo y los controles reflejen siempre el valor vigente. Forma parte de la gestión de la línea y por eso se ubica antes de su visualización.</w:t>
-      </w:r>
-    </w:p>
-    <w:p>
-      <w:pPr>
-        <w:spacing w:after="120"/>
-        <w:jc w:val="both"/>
-      </w:pPr>
-      <w:r>
-        <w:rPr>
-          <w:rFonts w:ascii="Calibri" w:cs="Calibri" w:eastAsia="Calibri" w:hAnsi="Calibri"/>
-          <w:sz w:val="21"/>
-          <w:szCs w:val="21"/>
-        </w:rPr>
-        <w:t xml:space="preserve">El comportamiento esperado es simple. La minuta indica que la línea es en dólares ajustable en pesos. El sistema recalcula el equivalente en pesos con el tipo de cambio de referencia, y tanto el consumo como el control de exceso de línea usan ese valor actualizado. La pantalla de líneas muestra el monto en dólares, el tipo de cambio aplicado y el equivalente en pesos.</w:t>
-      </w:r>
-    </w:p>
-    <w:p>
-      <w:pPr>
-        <w:spacing w:after="120"/>
-        <w:jc w:val="both"/>
-      </w:pPr>
-      <w:r>
-        <w:rPr>
-          <w:rFonts w:ascii="Calibri" w:cs="Calibri" w:eastAsia="Calibri" w:hAnsi="Calibri"/>
-          <w:sz w:val="21"/>
-          <w:szCs w:val="21"/>
-        </w:rPr>
-        <w:t xml:space="preserve">Este módulo necesita una definición técnica de Accusys antes de poder estimarse. Hay que confirmar si COBIS ya soporta líneas en una moneda con consumo en otra; qué tipo de cambio se usará (BNA, A3500 o el de Mesa) y con qué frecuencia se actualizará; qué debe ocurrir si una suba del tipo de cambio deja la línea excedida, es decir, si se bloquean las nuevas operaciones o solo se emite una alerta; y cómo impacta todo esto en el control del 15% de la RPC.</w:t>
+        <w:t xml:space="preserve">Módulo C · Avales de las líneas garantizadas</w:t>
+      </w:r>
+    </w:p>
+    <w:p>
+      <w:pPr>
+        <w:spacing w:after="120"/>
+        <w:jc w:val="both"/>
+      </w:pPr>
+      <w:r>
+        <w:rPr>
+          <w:rFonts w:ascii="Calibri" w:cs="Calibri" w:eastAsia="Calibri" w:hAnsi="Calibri"/>
+          <w:sz w:val="21"/>
+          <w:szCs w:val="21"/>
+        </w:rPr>
+        <w:t xml:space="preserve">El objetivo de este módulo es que las líneas garantizadas con avales tengan un circuito propio dentro del sistema: desde la definición de los avales en la línea hasta su autorización por Activas y su registro en las garantías de COBIS.</w:t>
+      </w:r>
+    </w:p>
+    <w:p>
+      <w:pPr>
+        <w:spacing w:after="120"/>
+        <w:jc w:val="both"/>
+      </w:pPr>
+      <w:r>
+        <w:rPr>
+          <w:rFonts w:ascii="Calibri" w:cs="Calibri" w:eastAsia="Calibri" w:hAnsi="Calibri"/>
+          <w:sz w:val="21"/>
+          <w:szCs w:val="21"/>
+        </w:rPr>
+        <w:t xml:space="preserve">El circuito comienza en la línea. Cuando una línea es garantizada, se puede indicar que cuenta con avales. Esa información pasa a Middle Office, que detalla qué avales ingresan y con qué vencimientos. Una línea puede tener más de un aval, y cada aval tiene su propia fecha de vencimiento. Cada aval tiene además un avalista, que debe estar dado de alta en COBIS MIS; si no lo está, no se puede cargar el aval.</w:t>
+      </w:r>
+    </w:p>
+    <w:p>
+      <w:pPr>
+        <w:spacing w:after="120"/>
+        <w:jc w:val="both"/>
+      </w:pPr>
+      <w:r>
+        <w:rPr>
+          <w:rFonts w:ascii="Calibri" w:cs="Calibri" w:eastAsia="Calibri" w:hAnsi="Calibri"/>
+          <w:sz w:val="21"/>
+          <w:szCs w:val="21"/>
+        </w:rPr>
+        <w:t xml:space="preserve">Junto con cada aval, Middle Office adjunta en el sistema los documentos que lo respaldan. Estos documentos se guardan solo a modo informativo, para que estén disponibles para su consulta, y no reemplazan el circuito formal de garantías.</w:t>
+      </w:r>
+    </w:p>
+    <w:p>
+      <w:pPr>
+        <w:spacing w:after="120"/>
+        <w:jc w:val="both"/>
+      </w:pPr>
+      <w:r>
+        <w:rPr>
+          <w:rFonts w:ascii="Calibri" w:cs="Calibri" w:eastAsia="Calibri" w:hAnsi="Calibri"/>
+          <w:sz w:val="21"/>
+          <w:szCs w:val="21"/>
+        </w:rPr>
+        <w:t xml:space="preserve">Una vez completada la carga de Middle Office, los avales pasan a Activas para su autorización. La conformidad de Activas cumple dos funciones al mismo tiempo: deja en vigencia la línea, o los subproductos garantizados por esos avales, y registra automáticamente cada aval en las garantías de COBIS, con su avalista y su vencimiento. De esta manera, el aval queda registrado una sola vez y en el mismo acto en que se autoriza, sin cargas manuales posteriores.</w:t>
+      </w:r>
+    </w:p>
+    <w:p>
+      <w:pPr>
+        <w:spacing w:after="120"/>
+        <w:jc w:val="both"/>
+      </w:pPr>
+      <w:r>
+        <w:rPr>
+          <w:rFonts w:ascii="Calibri" w:cs="Calibri" w:eastAsia="Calibri" w:hAnsi="Calibri"/>
+          <w:sz w:val="21"/>
+          <w:szCs w:val="21"/>
+        </w:rPr>
+        <w:t xml:space="preserve">Como los avales tienen fecha de vencimiento, sus vencimientos quedan visibles en la pantalla de líneas, de modo que el banco pueda anticiparse a ellos y gestionar su renovación.</w:t>
       </w:r>
     </w:p>
     <w:p>
@@ -1256,21 +1284,46 @@
           <w:sz w:val="21"/>
           <w:szCs w:val="21"/>
         </w:rPr>
-        <w:t xml:space="preserve">Para cada línea, la pantalla muestra el cliente, su CUIT y su grupo económico según COBIS MIS; el producto y los subproductos, la moneda, la minuta que aprobó la línea y su fecha de revisión; el monto aprobado, lo que consumen las operaciones vigentes y lo que queda disponible; el uso del grupo económico respecto del 15% de la RPC del banco, con una alerta cuando se acerca al límite; los vencimientos de la línea y de sus operaciones; el estado de cada subproducto, que puede estar activo, pendiente de garantía, forzado y pendiente de regularizar, vencido o por revisar; y el detalle de los préstamos, descubiertos, prefinanciaciones y cheques que consumen la línea.</w:t>
-      </w:r>
-    </w:p>
-    <w:p>
-      <w:pPr>
-        <w:spacing w:after="120"/>
-        <w:jc w:val="both"/>
-      </w:pPr>
-      <w:r>
-        <w:rPr>
-          <w:rFonts w:ascii="Calibri" w:cs="Calibri" w:eastAsia="Calibri" w:hAnsi="Calibri"/>
-          <w:sz w:val="21"/>
-          <w:szCs w:val="21"/>
-        </w:rPr>
-        <w:t xml:space="preserve">Desde la pantalla se pueden iniciar todas las operaciones. Se puede cargar un préstamo, que abre la carga del módulo G con el cliente, la línea y el disponible ya completos; cargar una prefinanciación de exportaciones o de importaciones sobre la línea elegida; cargar un descubierto, que abre el módulo F con el vencimiento y el disponible ya completos; renovar un descubierto, que lleva a la pantalla de vencimientos sobre el descubierto elegido; y descontar cheques, que abre el módulo H con los cheques endosados por el cliente. También se puede consultar la minuta aprobada, con sus versiones y las acciones ejecutadas, y filtrar y exportar la información por cliente, CUIT, grupo, oficial, producto, estado o vencimiento.</w:t>
+        <w:t xml:space="preserve">Para cada línea, la pantalla muestra el cliente, su CUIT y su grupo económico según COBIS MIS; el producto y los subproductos, la moneda, la minuta que aprobó la línea y su fecha de revisión; el monto aprobado, lo que consumen las operaciones vigentes y lo que queda disponible; el uso del grupo económico respecto del 15% de la RPC del banco, con una alerta cuando se acerca al límite; los vencimientos de la línea y de sus operaciones; el estado de cada subproducto, que puede estar activo, pendiente de garantía, forzado y pendiente de regularizar, vencido o por revisar; los avales de la línea, con su avalista y su vencimiento; y el detalle de los préstamos, descubiertos, prefinanciaciones y cheques que consumen la línea.</w:t>
+      </w:r>
+    </w:p>
+    <w:p>
+      <w:pPr>
+        <w:spacing w:after="120"/>
+        <w:jc w:val="both"/>
+      </w:pPr>
+      <w:r>
+        <w:rPr>
+          <w:rFonts w:ascii="Calibri" w:cs="Calibri" w:eastAsia="Calibri" w:hAnsi="Calibri"/>
+          <w:sz w:val="21"/>
+          <w:szCs w:val="21"/>
+        </w:rPr>
+        <w:t xml:space="preserve">Desde la pantalla se pueden iniciar todas las operaciones. Se puede cargar un préstamo, que abre la carga del módulo G con el cliente, la línea y el disponible ya completos; cargar una prefinanciación de exportaciones o de importaciones sobre la línea elegida; cargar un descubierto, que abre el módulo F con el vencimiento y el disponible ya completos; renovar un descubierto, que lleva a la pantalla de vencimientos sobre el descubierto elegido; y descontar cheques, que abre el módulo H con los cheques endosados por el cliente. En las líneas en dólares, también se puede solicitar una ampliación por actualización del tipo de cambio. Además, se puede consultar la minuta aprobada, con sus versiones y las acciones ejecutadas, y filtrar y exportar la información por cliente, CUIT, grupo, oficial, producto, estado o vencimiento.</w:t>
+      </w:r>
+    </w:p>
+    <w:p>
+      <w:pPr>
+        <w:pStyle w:val="Heading3"/>
+      </w:pPr>
+      <w:r>
+        <w:rPr>
+          <w:rFonts w:ascii="Calibri" w:cs="Calibri" w:eastAsia="Calibri" w:hAnsi="Calibri"/>
+        </w:rPr>
+        <w:t xml:space="preserve">Ampliación de líneas en dólares por tipo de cambio</w:t>
+      </w:r>
+    </w:p>
+    <w:p>
+      <w:pPr>
+        <w:spacing w:after="120"/>
+        <w:jc w:val="both"/>
+      </w:pPr>
+      <w:r>
+        <w:rPr>
+          <w:rFonts w:ascii="Calibri" w:cs="Calibri" w:eastAsia="Calibri" w:hAnsi="Calibri"/>
+          <w:sz w:val="21"/>
+          <w:szCs w:val="21"/>
+        </w:rPr>
+        <w:t xml:space="preserve">En reemplazo de una actualización automática de las líneas en dólares, la pantalla de líneas permite que Middle Office solicite una ampliación de la línea. Esta opción está disponible solo para líneas en dólares y solo bajo el concepto de actualización por tipo de cambio. Middle Office indica el incremento que solicita y el pedido pasa al gerente de Riesgos, que lo autoriza o lo rechaza. Con la autorización, la línea se amplía por el monto solicitado y la ampliación queda registrada con el pedido, el monto, el usuario que lo solicitó y el gerente que lo autorizó.</w:t>
       </w:r>
     </w:p>
     <w:p>
@@ -1310,7 +1363,7 @@
           <w:sz w:val="21"/>
           <w:szCs w:val="21"/>
         </w:rPr>
-        <w:t xml:space="preserve">Los módulos E a J cubren todo lo que consume una línea activa. Comparten tres principios: la operación nace en la pantalla de líneas, o en la de vencimientos si se trata de una renovación; queda asociada a su costo de fondeo; y se valida automáticamente.</w:t>
+        <w:t xml:space="preserve">Los módulos E a K cubren todo lo que consume una línea activa y la gestión posterior de las operaciones. Comparten tres principios: la operación nace en la pantalla de líneas, o en la de vencimientos si se trata de una renovación; queda asociada a su costo de fondeo; y se valida automáticamente.</w:t>
       </w:r>
     </w:p>
     <w:p>
@@ -1738,6 +1791,59 @@
           <w:szCs w:val="21"/>
         </w:rPr>
         <w:t xml:space="preserve">Se proponen, además, tres reportes adicionales: uno de minutas por estado, con las acciones automáticas que estén pendientes o hayan fallado, pensado para Riesgos; uno de consumo de línea por grupo económico, con lo aprobado, lo consumido y lo disponible, pensado para Riesgos y Comercial; y uno de costo de fondeo, con cada operación, su costo asociado y su tasa, pensado para Mesa y la Gerencia.</w:t>
+      </w:r>
+    </w:p>
+    <w:p>
+      <w:pPr>
+        <w:pStyle w:val="Heading2"/>
+      </w:pPr>
+      <w:r>
+        <w:rPr>
+          <w:rFonts w:ascii="Calibri" w:cs="Calibri" w:eastAsia="Calibri" w:hAnsi="Calibri"/>
+        </w:rPr>
+        <w:t xml:space="preserve">Módulo K · Modificación de tablas de amortización</w:t>
+      </w:r>
+    </w:p>
+    <w:p>
+      <w:pPr>
+        <w:spacing w:after="120"/>
+        <w:jc w:val="both"/>
+      </w:pPr>
+      <w:r>
+        <w:rPr>
+          <w:rFonts w:ascii="Calibri" w:cs="Calibri" w:eastAsia="Calibri" w:hAnsi="Calibri"/>
+          <w:sz w:val="21"/>
+          <w:szCs w:val="21"/>
+        </w:rPr>
+        <w:t xml:space="preserve">El objetivo de este módulo es permitir modificar la estructura de un préstamo ya otorgado, es decir, su tabla de amortización, dentro del sistema y con un circuito de aprobación controlado.</w:t>
+      </w:r>
+    </w:p>
+    <w:p>
+      <w:pPr>
+        <w:spacing w:after="120"/>
+        <w:jc w:val="both"/>
+      </w:pPr>
+      <w:r>
+        <w:rPr>
+          <w:rFonts w:ascii="Calibri" w:cs="Calibri" w:eastAsia="Calibri" w:hAnsi="Calibri"/>
+          <w:sz w:val="21"/>
+          <w:szCs w:val="21"/>
+        </w:rPr>
+        <w:t xml:space="preserve">El módulo tiene validaciones estrictas sobre qué se puede modificar. Solo se pueden modificar préstamos que ya fueron liquidados y que están activos. Dentro de esos préstamos, la modificación solo puede recaer sobre las cuotas que todavía no fueron cobradas; las cuotas ya cobradas no se pueden alterar. Si el préstamo no cumple estas condiciones, el sistema no permite iniciar la modificación.</w:t>
+      </w:r>
+    </w:p>
+    <w:p>
+      <w:pPr>
+        <w:spacing w:after="120"/>
+        <w:jc w:val="both"/>
+      </w:pPr>
+      <w:r>
+        <w:rPr>
+          <w:rFonts w:ascii="Calibri" w:cs="Calibri" w:eastAsia="Calibri" w:hAnsi="Calibri"/>
+          <w:sz w:val="21"/>
+          <w:szCs w:val="21"/>
+        </w:rPr>
+        <w:t xml:space="preserve">Para solicitar el cambio, el usuario debe adjuntar los documentos que respaldan la modificación; sin esa documentación, la solicitud no puede enviarse. Con la nueva estructura propuesta y los documentos adjuntos, la solicitud pasa a Activas para su aprobación. Recién con la aprobación de Activas se hace efectivo el cambio de estructura del préstamo, y las nuevas cuotas se reflejan en la pantalla de vencimientos. Cada modificación queda registrada con la tabla anterior, la nueva, los documentos y quién la solicitó y aprobó.</w:t>
       </w:r>
     </w:p>
     <w:p>
@@ -1802,7 +1908,7 @@
           <w:sz w:val="21"/>
           <w:szCs w:val="21"/>
         </w:rPr>
-        <w:t xml:space="preserve">En cuanto a las garantías de la línea, solo los subproductos que las requieren quedan pendientes hasta la conformidad de Activas, salvo que el gerente de Riesgos o el CEO fuercen el alta con regularización posterior. Los demás subproductos se impactan con la aprobación del comité.</w:t>
+        <w:t xml:space="preserve">En cuanto a las garantías de la línea, solo los subproductos que las requieren quedan pendientes hasta la conformidad de Activas, salvo que el gerente de Riesgos o el CEO fuercen el alta con regularización posterior. Los demás subproductos se impactan con la aprobación del comité. Una línea garantizada puede tener uno o más avales, cada uno con su vencimiento y con un avalista que debe estar en COBIS MIS; los documentos de los avales se adjuntan solo a modo informativo, y la conformidad de Activas deja la línea en vigencia y registra el aval en las garantías de COBIS. Las líneas en dólares solo se amplían por actualización del tipo de cambio a pedido de Middle Office y con la autorización del gerente de Riesgos.</w:t>
       </w:r>
     </w:p>
     <w:p>
@@ -1855,7 +1961,7 @@
           <w:sz w:val="21"/>
           <w:szCs w:val="21"/>
         </w:rPr>
-        <w:t xml:space="preserve">La pantalla de vencimientos muestra por defecto las próximas dos semanas, con un plazo configurable, y solo permite descargar recibos de operaciones efectivamente cobradas. Por último, en todo el circuito, cada aprobación, cada forzado y cada cambio de tasa queda registrado con usuario y fecha.</w:t>
+        <w:t xml:space="preserve">La pantalla de vencimientos muestra por defecto las próximas dos semanas, con un plazo configurable, y solo permite descargar recibos de operaciones efectivamente cobradas. Las tablas de amortización solo pueden modificarse en préstamos liquidados y activos, sobre las cuotas no cobradas, con documentación adjunta y con la aprobación de Activas. Por último, en todo el circuito, cada aprobación, cada forzado y cada cambio de tasa queda registrado con usuario y fecha.</w:t>
       </w:r>
     </w:p>
     <w:p>
@@ -1894,35 +2000,35 @@
           <w:sz w:val="21"/>
           <w:szCs w:val="21"/>
         </w:rPr>
-        <w:t xml:space="preserve">Riesgo de Crédito carga y edita el borrador de la minuta, con la participación del gerente de Riesgos. También revisa las excepciones de las operaciones y aprueba los cheques que se quieren forzar fuera del scoring. La aprobación de la minuta está a cargo del gerente de Riesgos, el CEO y el gerente comercial que corresponda según el oficial. El CEO firma por DocuSign las minutas del subcomité. El gerente de Riesgos y el CEO son los únicos que pueden forzar el alta de un subproducto con garantía pendiente.</w:t>
-      </w:r>
-    </w:p>
-    <w:p>
-      <w:pPr>
-        <w:spacing w:after="120"/>
-        <w:jc w:val="both"/>
-      </w:pPr>
-      <w:r>
-        <w:rPr>
-          <w:rFonts w:ascii="Calibri" w:cs="Calibri" w:eastAsia="Calibri" w:hAnsi="Calibri"/>
-          <w:sz w:val="21"/>
-          <w:szCs w:val="21"/>
-        </w:rPr>
-        <w:t xml:space="preserve">Middle Office es el área que opera. Carga los préstamos, las prefinanciaciones y los descubiertos; renueva los descubiertos desde la pantalla de vencimientos; y carga y simula los descuentos de cheques.</w:t>
-      </w:r>
-    </w:p>
-    <w:p>
-      <w:pPr>
-        <w:spacing w:after="120"/>
-        <w:jc w:val="both"/>
-      </w:pPr>
-      <w:r>
-        <w:rPr>
-          <w:rFonts w:ascii="Calibri" w:cs="Calibri" w:eastAsia="Calibri" w:hAnsi="Calibri"/>
-          <w:sz w:val="21"/>
-          <w:szCs w:val="21"/>
-        </w:rPr>
-        <w:t xml:space="preserve">Activas otorga la conformidad de las garantías y aprueba el acuerdo marco de cheques, con la parametrización de la cuenta de desembolso. Mesa carga y mantiene el costo de fondeo por plazo y las tasas mínimas.</w:t>
+        <w:t xml:space="preserve">Riesgo de Crédito carga y edita el borrador de la minuta, con la participación del gerente de Riesgos. También revisa las excepciones de las operaciones y aprueba los cheques que se quieren forzar fuera del scoring. La aprobación de la minuta está a cargo del gerente de Riesgos, el CEO y el gerente comercial que corresponda según el oficial. El CEO firma por DocuSign las minutas del subcomité. El gerente de Riesgos y el CEO son los únicos que pueden forzar el alta de un subproducto con garantía pendiente. El gerente de Riesgos, además, autoriza las ampliaciones de las líneas en dólares por actualización del tipo de cambio.</w:t>
+      </w:r>
+    </w:p>
+    <w:p>
+      <w:pPr>
+        <w:spacing w:after="120"/>
+        <w:jc w:val="both"/>
+      </w:pPr>
+      <w:r>
+        <w:rPr>
+          <w:rFonts w:ascii="Calibri" w:cs="Calibri" w:eastAsia="Calibri" w:hAnsi="Calibri"/>
+          <w:sz w:val="21"/>
+          <w:szCs w:val="21"/>
+        </w:rPr>
+        <w:t xml:space="preserve">Middle Office es el área que opera. Detalla los avales de las líneas garantizadas y adjunta sus documentos; solicita las ampliaciones de las líneas en dólares; carga los préstamos, las prefinanciaciones y los descubiertos; renueva los descubiertos desde la pantalla de vencimientos; carga y simula los descuentos de cheques; y solicita las modificaciones de tablas de amortización.</w:t>
+      </w:r>
+    </w:p>
+    <w:p>
+      <w:pPr>
+        <w:spacing w:after="120"/>
+        <w:jc w:val="both"/>
+      </w:pPr>
+      <w:r>
+        <w:rPr>
+          <w:rFonts w:ascii="Calibri" w:cs="Calibri" w:eastAsia="Calibri" w:hAnsi="Calibri"/>
+          <w:sz w:val="21"/>
+          <w:szCs w:val="21"/>
+        </w:rPr>
+        <w:t xml:space="preserve">Activas otorga la conformidad de las garantías; autoriza los avales, con lo que deja la línea en vigencia y los registra en las garantías de COBIS; aprueba el acuerdo marco de cheques, con la parametrización de la cuenta de desembolso; y aprueba las modificaciones de tablas de amortización. Mesa carga y mantiene el costo de fondeo por plazo y las tasas mínimas.</w:t>
       </w:r>
     </w:p>
     <w:p>
@@ -1950,7 +2056,7 @@
           <w:sz w:val="21"/>
           <w:szCs w:val="21"/>
         </w:rPr>
-        <w:t xml:space="preserve">Participan también otros actores. Red BI tiene a su cargo el desarrollo en COBIS Web. Accusys debe definir la solución técnica para la línea en dólares ajustable en pesos. El equipo del desarrollo de modernización debe integrar el scoring de cheques. Y Sistemas y Operaciones, con Daniel Semino y Jonathan Domínguez, están a cargo del relevamiento, la coordinación y el seguimiento del proyecto.</w:t>
+        <w:t xml:space="preserve">Participan también otros actores. Red BI tiene a su cargo el desarrollo en COBIS Web. El equipo del desarrollo de modernización debe integrar el scoring de cheques. Y Sistemas y Operaciones, con Daniel Semino y Jonathan Domínguez, están a cargo del relevamiento, la coordinación y el seguimiento del proyecto.</w:t>
       </w:r>
     </w:p>
     <w:p>
@@ -2083,35 +2189,35 @@
           <w:sz w:val="21"/>
           <w:szCs w:val="21"/>
         </w:rPr>
-        <w:t xml:space="preserve">La primera fase, de minutas, líneas y costeo, incluye los módulos A, B y E. Entrega la pantalla de minutas con la aprobación y sus acciones automáticas, el alta de líneas con la gestión de garantías por subproducto y el forzado, y el costeo con el costo de fondeo y las tasas mínimas. Es la base sobre la que se apoya todo lo demás.</w:t>
-      </w:r>
-    </w:p>
-    <w:p>
-      <w:pPr>
-        <w:spacing w:after="120"/>
-        <w:jc w:val="both"/>
-      </w:pPr>
-      <w:r>
-        <w:rPr>
-          <w:rFonts w:ascii="Calibri" w:cs="Calibri" w:eastAsia="Calibri" w:hAnsi="Calibri"/>
-          <w:sz w:val="21"/>
-          <w:szCs w:val="21"/>
-        </w:rPr>
-        <w:t xml:space="preserve">La segunda fase, de operaciones, incluye los módulos D, F, I y J. Entrega la pantalla de líneas como punto de entrada, la carga guiada de descubiertos, la pantalla de vencimientos con la renovación, y el seguimiento y los reportes. Se prioriza porque concentra el mayor volumen operativo y elimina el control manual del fraccionamiento.</w:t>
-      </w:r>
-    </w:p>
-    <w:p>
-      <w:pPr>
-        <w:spacing w:after="120"/>
-        <w:jc w:val="both"/>
-      </w:pPr>
-      <w:r>
-        <w:rPr>
-          <w:rFonts w:ascii="Calibri" w:cs="Calibri" w:eastAsia="Calibri" w:hAnsi="Calibri"/>
-          <w:sz w:val="21"/>
-          <w:szCs w:val="21"/>
-        </w:rPr>
-        <w:t xml:space="preserve">La tercera fase, de complementos, incluye los módulos G, H y C. Entrega la carga de préstamos con tablas de amortización, el descuento de cheques con scoring y la línea en dólares ajustable en pesos. Se deja para el final porque estos módulos requieren un relevamiento adicional o definiciones de terceros, como Accusys y el desarrollo de modernización.</w:t>
+        <w:t xml:space="preserve">La primera fase, de minutas, líneas y costeo, incluye los módulos A, B, C y E. Entrega la pantalla de minutas con la aprobación y sus acciones automáticas, el alta de líneas con la gestión de garantías por subproducto y el forzado, el circuito de avales con su registro en las garantías de COBIS, y el costeo con el costo de fondeo y las tasas mínimas. Es la base sobre la que se apoya todo lo demás.</w:t>
+      </w:r>
+    </w:p>
+    <w:p>
+      <w:pPr>
+        <w:spacing w:after="120"/>
+        <w:jc w:val="both"/>
+      </w:pPr>
+      <w:r>
+        <w:rPr>
+          <w:rFonts w:ascii="Calibri" w:cs="Calibri" w:eastAsia="Calibri" w:hAnsi="Calibri"/>
+          <w:sz w:val="21"/>
+          <w:szCs w:val="21"/>
+        </w:rPr>
+        <w:t xml:space="preserve">La segunda fase, de operaciones, incluye los módulos D, F, I y J. Entrega la pantalla de líneas como punto de entrada, con la solicitud de ampliación de las líneas en dólares, la carga guiada de descubiertos, la pantalla de vencimientos con la renovación, y el seguimiento y los reportes. Se prioriza porque concentra el mayor volumen operativo y elimina el control manual del fraccionamiento.</w:t>
+      </w:r>
+    </w:p>
+    <w:p>
+      <w:pPr>
+        <w:spacing w:after="120"/>
+        <w:jc w:val="both"/>
+      </w:pPr>
+      <w:r>
+        <w:rPr>
+          <w:rFonts w:ascii="Calibri" w:cs="Calibri" w:eastAsia="Calibri" w:hAnsi="Calibri"/>
+          <w:sz w:val="21"/>
+          <w:szCs w:val="21"/>
+        </w:rPr>
+        <w:t xml:space="preserve">La tercera fase, de complementos, incluye los módulos G, H y K. Entrega la carga de préstamos con tablas de amortización, el descuento de cheques con scoring y la modificación de tablas de amortización de préstamos activos. Se deja para el final porque estos módulos requieren un relevamiento adicional o definiciones de terceros, como el desarrollo de modernización.</w:t>
       </w:r>
     </w:p>
     <w:p>
@@ -2164,7 +2270,7 @@
           <w:sz w:val="21"/>
           <w:szCs w:val="21"/>
         </w:rPr>
-        <w:t xml:space="preserve">El primero es la capacidad y los plazos de Red BI, que pueden demorar todo el proyecto. Para mitigarlo, se propone priorizar por fases y acordar un cronograma por módulo. El segundo es la definición de Accusys sobre la línea en dólares, que bloquea el módulo C; por eso conviene consultar de inmediato y dejar ese módulo para la tercera fase.</w:t>
+        <w:t xml:space="preserve">El primero es la capacidad y los plazos de Red BI, que pueden demorar todo el proyecto. Para mitigarlo, se propone priorizar por fases y acordar un cronograma por módulo. El segundo es el registro automático de los avales en las garantías de COBIS, que es la base del módulo C; hay que confirmar con Red BI cómo se integra con COBIS antes de estimarlo.</w:t>
       </w:r>
     </w:p>
     <w:p>
@@ -2231,7 +2337,7 @@
           <w:sz w:val="21"/>
           <w:szCs w:val="21"/>
         </w:rPr>
-        <w:t xml:space="preserve">En el costeo, hay que definir los tramos de plazo del costo de fondeo y si varían por moneda, y quién carga y mantiene la tasa de descuento precargada de los cheques, que podría ser Mesa desde el módulo E. En los préstamos, hay que decidir si las tablas de amortización se generan a partir de las condiciones o se importan desde un archivo. En los descubiertos, hay que confirmar el rango definitivo de acuerdos con y sin full numerales, ya que la división entre C1 a C5 y C6 a C9 es solo un ejemplo.</w:t>
+        <w:t xml:space="preserve">En el costeo, hay que definir los tramos de plazo del costo de fondeo y si varían por moneda, y quién carga y mantiene la tasa de descuento precargada de los cheques, que podría ser Mesa desde el módulo E. En los préstamos, hay que decidir si las tablas de amortización se generan a partir de las condiciones o se importan desde un archivo, y qué tipos de documentos se exigen para modificarlas. En los avales, hay que definir qué documentos se adjuntan y cómo se gestiona su vencimiento. En los descubiertos, hay que confirmar el rango definitivo de acuerdos con y sin full numerales, ya que la división entre C1 a C5 y C6 a C9 es solo un ejemplo.</w:t>
       </w:r>
     </w:p>
     <w:p>
@@ -2285,7 +2391,7 @@
           <w:sz w:val="21"/>
           <w:szCs w:val="21"/>
         </w:rPr>
-        <w:t xml:space="preserve">Los pasos siguientes están a cargo de Sistemas: definir con el equipo de modernización la integración del scoring de cheques, presentar el alcance a Red BI para pedir una estimación por módulo, y consultar a Accusys por la línea en dólares ajustable en pesos. El último paso es acordar la priorización por fases y el cronograma entre la Gerencia de Operaciones, Comercial y Riesgos.</w:t>
+        <w:t xml:space="preserve">Los pasos siguientes están a cargo de Sistemas: definir con el equipo de modernización la integración del scoring de cheques, presentar el alcance a Red BI para pedir una estimación por módulo, y confirmar con Red BI la integración del registro de avales en las garantías de COBIS. El último paso es acordar la priorización por fases y el cronograma entre la Gerencia de Operaciones, Comercial y Riesgos.</w:t>
       </w:r>
     </w:p>
     <w:p>

</xml_diff>

<commit_message>
Aplicar adecuaciones VR2: plazo de línea, fianzas generales, adenda, amortización y RPC
Co-Authored-By: Claude Opus 5.5 <noreply@anthropic.com>
Claude-Session: https://claude.ai/code/session_01JR48ZtjHAJWp3RfTGUyHxs
</commit_message>
<xml_diff>
--- a/Informe_Nueva_Aplicacion_Gestion_Middle_Office.docx
+++ b/Informe_Nueva_Aplicacion_Gestion_Middle_Office.docx
@@ -111,7 +111,7 @@
           <w:sz w:val="22"/>
           <w:szCs w:val="22"/>
         </w:rPr>
-        <w:t xml:space="preserve">Fecha: 14 de octubre de 2026</w:t>
+        <w:t xml:space="preserve">Fecha: 19 de octubre de 2026</w:t>
       </w:r>
     </w:p>
     <w:p>
@@ -1002,7 +1002,7 @@
           <w:sz w:val="21"/>
           <w:szCs w:val="21"/>
         </w:rPr>
-        <w:t xml:space="preserve">La minuta digital reúne los mismos datos que la actual, más los que necesita el nuevo circuito. Riesgos carga el CUIT y la razón social del cliente, que son obligatorios; con el CUIT, el sistema busca el grupo económico en COBIS MIS y, si no lo encuentra, marca al cliente para un alta simplificada. Además, el sistema consulta Nosis y verifica que la situación del cliente sea 1. El oficial de la cuenta también es obligatorio, porque define qué gerente comercial interviene en la aprobación. Si el cliente ya tiene una línea, el sistema trae la línea presente desde COBIS. Riesgos completa la línea propuesta, con su monto, su moneda y sus subproductos; el rating crediticio, la situación según el BCRA y la fecha de revisión; y las garantías, indicando qué subproductos las requieren, de qué tipo y si la línea se garantiza con avales. Con esa información, el sistema sugiere si la minuta debe ir al comité de los martes o al subcomité de los viernes.</w:t>
+        <w:t xml:space="preserve">La minuta digital reúne los mismos datos que la actual, más los que necesita el nuevo circuito. Riesgos carga el CUIT y la razón social del cliente, que son obligatorios; con el CUIT, el sistema busca el grupo económico en COBIS MIS y, si no lo encuentra, marca al cliente para un alta simplificada. Además, el sistema consulta Nosis y verifica que la situación del cliente sea 1. El oficial de la cuenta también es obligatorio, porque define qué gerente comercial interviene en la aprobación. Si el cliente ya tiene una línea, el sistema trae la línea presente desde COBIS. Riesgos completa la línea propuesta, con su monto, su moneda, sus subproductos y su plazo; el rating crediticio, la situación según el BCRA y la fecha de revisión; y las garantías, indicando qué subproductos las requieren, de qué tipo y si la línea se garantiza con avales. Con esa información, el sistema sugiere si la minuta debe ir al comité de los martes o al subcomité de los viernes.</w:t>
       </w:r>
     </w:p>
     <w:p>
@@ -1055,7 +1055,7 @@
           <w:sz w:val="21"/>
           <w:szCs w:val="21"/>
         </w:rPr>
-        <w:t xml:space="preserve">La primera y principal es el alta o la modificación de la línea en COBIS, por grupo económico, con el monto, la moneda, los subproductos y la fecha de revisión aprobados. Si el CUIT no está en COBIS MIS, el sistema da de alta al cliente de forma simplificada, con su CUIT, su razón social y su rating, y lo deja marcado para que se complete más adelante.</w:t>
+        <w:t xml:space="preserve">La primera y principal es el alta o la modificación de la línea en COBIS, por grupo económico, con el monto, la moneda, los subproductos, el plazo, la fecha de vencimiento y la fecha de revisión aprobados. Si el CUIT no está en COBIS MIS, el sistema da de alta al cliente de forma simplificada, con su CUIT, su razón social y su rating, y lo deja marcado para que se complete más adelante.</w:t>
       </w:r>
     </w:p>
     <w:p>
@@ -1203,21 +1203,21 @@
           <w:sz w:val="21"/>
           <w:szCs w:val="21"/>
         </w:rPr>
-        <w:t xml:space="preserve">El circuito comienza en la línea. Cuando una línea es garantizada, se puede indicar que cuenta con avales. Esa información pasa a Middle Office, que detalla qué avales ingresan y con qué vencimientos. Una línea puede tener más de un aval, y cada aval tiene su propia fecha de vencimiento. Cada aval tiene además un avalista, que debe estar dado de alta en COBIS MIS; si no lo está, no se puede cargar el aval.</w:t>
-      </w:r>
-    </w:p>
-    <w:p>
-      <w:pPr>
-        <w:spacing w:after="120"/>
-        <w:jc w:val="both"/>
-      </w:pPr>
-      <w:r>
-        <w:rPr>
-          <w:rFonts w:ascii="Calibri" w:cs="Calibri" w:eastAsia="Calibri" w:hAnsi="Calibri"/>
-          <w:sz w:val="21"/>
-          <w:szCs w:val="21"/>
-        </w:rPr>
-        <w:t xml:space="preserve">Junto con cada aval, Middle Office adjunta en el sistema los documentos que lo respaldan. Estos documentos se guardan solo a modo informativo, para que estén disponibles para su consulta, y no reemplazan el circuito formal de garantías.</w:t>
+        <w:t xml:space="preserve">En la práctica, estos avales son fianzas generales que se otorgan para respaldar la línea. El circuito comienza en la línea. Cuando una línea es garantizada, se puede indicar que cuenta con avales. Esa información pasa a Middle Office, que detalla qué avales ingresan y con qué vencimientos. Una línea puede tener más de un aval, y cada aval tiene su propia fecha de vencimiento. Cada aval tiene además un avalista, que debe estar dado de alta en COBIS MIS; si no lo está, no se puede cargar el aval.</w:t>
+      </w:r>
+    </w:p>
+    <w:p>
+      <w:pPr>
+        <w:spacing w:after="120"/>
+        <w:jc w:val="both"/>
+      </w:pPr>
+      <w:r>
+        <w:rPr>
+          <w:rFonts w:ascii="Calibri" w:cs="Calibri" w:eastAsia="Calibri" w:hAnsi="Calibri"/>
+          <w:sz w:val="21"/>
+          <w:szCs w:val="21"/>
+        </w:rPr>
+        <w:t xml:space="preserve">Junto con cada aval, Middle Office adjunta en el sistema la fianza general que lo respalda. Estos documentos se guardan solo a modo informativo, para que estén disponibles para su consulta, y no reemplazan el circuito formal de garantías.</w:t>
       </w:r>
     </w:p>
     <w:p>
@@ -1284,7 +1284,7 @@
           <w:sz w:val="21"/>
           <w:szCs w:val="21"/>
         </w:rPr>
-        <w:t xml:space="preserve">Para cada línea, la pantalla muestra el cliente, su CUIT y su grupo económico según COBIS MIS; el producto y los subproductos, la moneda, la minuta que aprobó la línea y su fecha de revisión; el monto aprobado, lo que consumen las operaciones vigentes y lo que queda disponible; el uso del grupo económico respecto del 15% de la RPC del banco, con una alerta cuando se acerca al límite; los vencimientos de la línea y de sus operaciones; el estado de cada subproducto, que puede estar activo, pendiente de garantía, forzado y pendiente de regularizar, vencido o por revisar; los avales de la línea, con su avalista y su vencimiento; y el detalle de los préstamos, descubiertos, prefinanciaciones y cheques que consumen la línea.</w:t>
+        <w:t xml:space="preserve">Para cada línea, la pantalla muestra el cliente, su CUIT y su grupo económico según COBIS MIS; el producto, los subproductos y su plazo, la moneda, la minuta que aprobó la línea y su fecha de revisión; el monto aprobado, lo que consumen las operaciones vigentes y lo que queda disponible; el uso del grupo económico respecto del 15% de la RPC del banco, con una alerta cuando se acerca al límite; los vencimientos de la línea y de sus operaciones; el estado de cada subproducto, que puede estar activo, pendiente de garantía, forzado y pendiente de regularizar, vencido o por revisar; los avales de la línea, con su avalista y su vencimiento; y el detalle de los préstamos, descubiertos, prefinanciaciones y cheques que consumen la línea.</w:t>
       </w:r>
     </w:p>
     <w:p>
@@ -1522,7 +1522,7 @@
           <w:sz w:val="21"/>
           <w:szCs w:val="21"/>
         </w:rPr>
-        <w:t xml:space="preserve">La carga se inicia sobre la línea elegida, con el cliente, la línea y el disponible ya completos. El usuario elige el tipo de préstamo por su nombre descriptivo y no por su código, que el sistema resuelve internamente. Luego ingresa las condiciones: monto, plazo, tasa, moneda y sistema de amortización. La tabla de amortización, con el capital, los intereses y el vencimiento de cada cuota, se genera o se importa automáticamente, sin cargarla cuota por cuota.</w:t>
+        <w:t xml:space="preserve">La carga se inicia sobre la línea elegida, con el cliente, la línea y el disponible ya completos. El usuario elige el tipo de préstamo por su nombre descriptivo y no por su código, que el sistema resuelve internamente. Luego ingresa las condiciones: monto, plazo, tasa, moneda y sistema de amortización. La tabla de amortización, con el capital, los intereses y el vencimiento de cada cuota, se genera a partir de las condiciones: el usuario elige el sistema de amortización y el sistema calcula las cuotas. No se importa desde ningún archivo. Solo cuando el préstamo tiene una estructura particular, que no responde a un sistema de amortización estándar, las cuotas se cargan a mano una por una.</w:t>
       </w:r>
     </w:p>
     <w:p>
@@ -1550,7 +1550,7 @@
           <w:sz w:val="21"/>
           <w:szCs w:val="21"/>
         </w:rPr>
-        <w:t xml:space="preserve">Queda por relevar con Middle Office el circuito actual de préstamos, y definir si las tablas de amortización se generarán a partir de las condiciones del préstamo o se importarán desde un archivo.</w:t>
+        <w:t xml:space="preserve">Queda por relevar con Middle Office el circuito actual de préstamos.</w:t>
       </w:r>
     </w:p>
     <w:p>
@@ -1843,7 +1843,7 @@
           <w:sz w:val="21"/>
           <w:szCs w:val="21"/>
         </w:rPr>
-        <w:t xml:space="preserve">Para solicitar el cambio, el usuario debe adjuntar los documentos que respaldan la modificación; sin esa documentación, la solicitud no puede enviarse. Con la nueva estructura propuesta y los documentos adjuntos, la solicitud pasa a Activas para su aprobación. Recién con la aprobación de Activas se hace efectivo el cambio de estructura del préstamo, y las nuevas cuotas se reflejan en la pantalla de vencimientos. Cada modificación queda registrada con la tabla anterior, la nueva, los documentos y quién la solicitó y aprobó.</w:t>
+        <w:t xml:space="preserve">Para solicitar el cambio, el usuario debe adjuntar la adenda que respalda la modificación; sin esa adenda, la solicitud no puede enviarse. Con la nueva estructura propuesta y la adenda adjunta, la solicitud pasa a Activas para su aprobación. Recién con la aprobación de Activas se hace efectivo el cambio de estructura del préstamo, y las nuevas cuotas se reflejan en la pantalla de vencimientos. Cada modificación queda registrada con la tabla anterior, la nueva, la adenda y quién la solicitó y aprobó.</w:t>
       </w:r>
     </w:p>
     <w:p>
@@ -1933,7 +1933,7 @@
           <w:sz w:val="21"/>
           <w:szCs w:val="21"/>
         </w:rPr>
-        <w:t xml:space="preserve">Toda operación se inicia desde una línea vigente en la pantalla de líneas, salvo las renovaciones, que se inician desde la pantalla de vencimientos. En cada operación, la suma de las operaciones del grupo no puede superar la línea aprobada y ningún grupo puede superar el 15% de la RPC del banco. Cada operación, al cargarse o renovarse, queda asociada al costo de fondeo del plazo máximo otorgado, y su tasa debe ser superior a la tasa mínima cargada por Mesa. Cuando una operación lleva garantía, su alta queda condicionada a la conformidad de Activas.</w:t>
+        <w:t xml:space="preserve">Toda operación se inicia desde una línea vigente en la pantalla de líneas, salvo las renovaciones, que se inician desde la pantalla de vencimientos. En cada operación, la suma de las operaciones del grupo no puede superar la línea aprobada y ningún grupo puede superar el 15% de la RPC del banco, calculada según la normativa del BCRA sobre grandes exposiciones al riesgo de crédito (punto 2.1). Cada operación, al cargarse o renovarse, queda asociada al costo de fondeo del plazo máximo otorgado, y su tasa debe ser superior a la tasa mínima cargada por Mesa. Cuando una operación lleva garantía, su alta queda condicionada a la conformidad de Activas.</w:t>
       </w:r>
     </w:p>
     <w:p>
@@ -1961,7 +1961,7 @@
           <w:sz w:val="21"/>
           <w:szCs w:val="21"/>
         </w:rPr>
-        <w:t xml:space="preserve">La pantalla de vencimientos muestra por defecto las próximas dos semanas, con un plazo configurable, y solo permite descargar recibos de operaciones efectivamente cobradas. Las tablas de amortización solo pueden modificarse en préstamos liquidados y activos, sobre las cuotas no cobradas, con documentación adjunta y con la aprobación de Activas. Por último, en todo el circuito, cada aprobación, cada forzado y cada cambio de tasa queda registrado con usuario y fecha.</w:t>
+        <w:t xml:space="preserve">La pantalla de vencimientos muestra por defecto las próximas dos semanas, con un plazo configurable, y solo permite descargar recibos de operaciones efectivamente cobradas. Las tablas de amortización solo pueden modificarse en préstamos liquidados y activos, sobre las cuotas no cobradas, con la adenda adjunta y con la aprobación de Activas. Por último, en todo el circuito, cada aprobación, cada forzado y cada cambio de tasa queda registrado con usuario y fecha.</w:t>
       </w:r>
     </w:p>
     <w:p>
@@ -2014,7 +2014,7 @@
           <w:sz w:val="21"/>
           <w:szCs w:val="21"/>
         </w:rPr>
-        <w:t xml:space="preserve">Middle Office es el área que opera. Detalla los avales de las líneas garantizadas y adjunta sus documentos; solicita las ampliaciones de las líneas en dólares; carga los préstamos, las prefinanciaciones y los descubiertos; renueva los descubiertos desde la pantalla de vencimientos; carga y simula los descuentos de cheques; y solicita las modificaciones de tablas de amortización.</w:t>
+        <w:t xml:space="preserve">Middle Office es el área que opera. Detalla los avales de las líneas garantizadas y adjunta las fianzas generales; solicita las ampliaciones de las líneas en dólares; carga los préstamos, las prefinanciaciones y los descubiertos; renueva los descubiertos desde la pantalla de vencimientos; carga y simula los descuentos de cheques; y solicita las modificaciones de tablas de amortización.</w:t>
       </w:r>
     </w:p>
     <w:p>
@@ -2337,21 +2337,21 @@
           <w:sz w:val="21"/>
           <w:szCs w:val="21"/>
         </w:rPr>
-        <w:t xml:space="preserve">En el costeo, hay que definir los tramos de plazo del costo de fondeo y si varían por moneda, y quién carga y mantiene la tasa de descuento precargada de los cheques, que podría ser Mesa desde el módulo E. En los préstamos, hay que decidir si las tablas de amortización se generan a partir de las condiciones o se importan desde un archivo, y qué tipos de documentos se exigen para modificarlas. En los avales, hay que definir qué documentos se adjuntan y cómo se gestiona su vencimiento. En los descubiertos, hay que confirmar el rango definitivo de acuerdos con y sin full numerales, ya que la división entre C1 a C5 y C6 a C9 es solo un ejemplo.</w:t>
-      </w:r>
-    </w:p>
-    <w:p>
-      <w:pPr>
-        <w:spacing w:after="120"/>
-        <w:jc w:val="both"/>
-      </w:pPr>
-      <w:r>
-        <w:rPr>
-          <w:rFonts w:ascii="Calibri" w:cs="Calibri" w:eastAsia="Calibri" w:hAnsi="Calibri"/>
-          <w:sz w:val="21"/>
-          <w:szCs w:val="21"/>
-        </w:rPr>
-        <w:t xml:space="preserve">También deben definirse los criterios y la auditoría del forzado de alta por parte del gerente de Riesgos o el CEO; el cálculo de la RPC que se usa en el control del 15% y su frecuencia de actualización; y el alcance de la definición de que "todo lo que está en Trámites y Gestión pase por COBIS Web", para confirmar si incluye otros productos. Por último, este informe debe contrastarse con la transcripción de la reunión del 7 de octubre, que hay que descargar desde Teams.</w:t>
+        <w:t xml:space="preserve">En el costeo, hay que definir los tramos de plazo del costo de fondeo y si varían por moneda, y quién carga y mantiene la tasa de descuento precargada de los cheques, que podría ser Mesa desde el módulo E. En los avales, hay que definir cómo se gestiona su vencimiento. En los descubiertos, hay que confirmar el rango definitivo de acuerdos con y sin full numerales, ya que la división entre C1 a C5 y C6 a C9 es solo un ejemplo.</w:t>
+      </w:r>
+    </w:p>
+    <w:p>
+      <w:pPr>
+        <w:spacing w:after="120"/>
+        <w:jc w:val="both"/>
+      </w:pPr>
+      <w:r>
+        <w:rPr>
+          <w:rFonts w:ascii="Calibri" w:cs="Calibri" w:eastAsia="Calibri" w:hAnsi="Calibri"/>
+          <w:sz w:val="21"/>
+          <w:szCs w:val="21"/>
+        </w:rPr>
+        <w:t xml:space="preserve">También deben definirse los criterios y la auditoría del forzado de alta por parte del gerente de Riesgos o el CEO; y el alcance de la definición de que "todo lo que está en Trámites y Gestión pase por COBIS Web", para confirmar si incluye otros productos. Por último, este informe debe contrastarse con la transcripción de la reunión del 7 de octubre, que hay que descargar desde Teams.</w:t>
       </w:r>
     </w:p>
     <w:p>

</xml_diff>

<commit_message>
Agregar operaciones y días disponibles de la línea, y módulo de cheques por cliente (COELSA)
Co-Authored-By: Claude Opus 5.5 <noreply@anthropic.com>
Claude-Session: https://claude.ai/code/session_01JR48ZtjHAJWp3RfTGUyHxs
</commit_message>
<xml_diff>
--- a/Informe_Nueva_Aplicacion_Gestion_Middle_Office.docx
+++ b/Informe_Nueva_Aplicacion_Gestion_Middle_Office.docx
@@ -381,7 +381,7 @@
           <w:sz w:val="21"/>
           <w:szCs w:val="21"/>
         </w:rPr>
-        <w:t xml:space="preserve">Aprobar el alcance de los once módulos que se describen en este informe.</w:t>
+        <w:t xml:space="preserve">Aprobar el alcance de los doce módulos que se describen en este informe.</w:t>
       </w:r>
     </w:p>
     <w:p>
@@ -909,7 +909,7 @@
           <w:sz w:val="21"/>
           <w:szCs w:val="21"/>
         </w:rPr>
-        <w:t xml:space="preserve">El proyecto se organiza en once módulos, identificados con las letras A a K, que se agrupan en dos bloques.</w:t>
+        <w:t xml:space="preserve">El proyecto se organiza en doce módulos, identificados con las letras A a L, que se agrupan en dos bloques.</w:t>
       </w:r>
     </w:p>
     <w:p>
@@ -937,7 +937,7 @@
           <w:sz w:val="21"/>
           <w:szCs w:val="21"/>
         </w:rPr>
-        <w:t xml:space="preserve">El segundo bloque reúne los módulos que se apoyan en la línea activa. El módulo E es el costeo de las operaciones, donde Mesa carga el costo de fondeo por plazo y las tasas mínimas. El módulo F cubre las operaciones de descubierto. El módulo G es la carga de préstamos. El módulo H es el descuento de cheques. El módulo I es la pantalla de vencimientos, que incluye la renovación de descubiertos y la descarga de recibos. El módulo J reúne el seguimiento y los reportes. Por último, el módulo K, también nuevo, permite modificar las tablas de amortización de préstamos activos.</w:t>
+        <w:t xml:space="preserve">El segundo bloque reúne los módulos que se apoyan en la línea activa. El módulo E es el costeo de las operaciones, donde Mesa carga el costo de fondeo por plazo y las tasas mínimas. El módulo F cubre las operaciones de descubierto. El módulo G es la carga de préstamos. El módulo H es el descuento de cheques. El módulo I es la pantalla de vencimientos, que incluye la renovación de descubiertos y la descarga de recibos. El módulo J reúne el seguimiento y los reportes. El módulo K, también nuevo, permite modificar las tablas de amortización de préstamos activos. Por último, el módulo L incorpora un apartado para consultar los cheques de cada cliente contra COELSA.</w:t>
       </w:r>
     </w:p>
     <w:p>
@@ -1284,7 +1284,7 @@
           <w:sz w:val="21"/>
           <w:szCs w:val="21"/>
         </w:rPr>
-        <w:t xml:space="preserve">Para cada línea, la pantalla muestra el cliente, su CUIT y su grupo económico según COBIS MIS; el producto, los subproductos y su plazo, la moneda, la minuta que aprobó la línea y su fecha de revisión; el monto aprobado, lo que consumen las operaciones vigentes y lo que queda disponible; el uso del grupo económico respecto del 15% de la RPC del banco, con una alerta cuando se acerca al límite; los vencimientos de la línea y de sus operaciones; el estado de cada subproducto, que puede estar activo, pendiente de garantía, forzado y pendiente de regularizar, vencido o por revisar; los avales de la línea, con su avalista y su vencimiento; y el detalle de los préstamos, descubiertos, prefinanciaciones y cheques que consumen la línea.</w:t>
+        <w:t xml:space="preserve">Para cada línea, la pantalla muestra el cliente, su CUIT y su grupo económico según COBIS MIS; el producto, los subproductos y su plazo, la moneda, la minuta que aprobó la línea y su fecha de revisión; el monto aprobado, lo que consumen las operaciones vigentes y lo que queda disponible; el uso del grupo económico respecto del 15% de la RPC del banco, con una alerta cuando se acerca al límite; los vencimientos de la línea y de sus operaciones; la cantidad de días que le quedan disponibles a la línea hasta su vencimiento; el estado de cada subproducto, que puede estar activo, pendiente de garantía, forzado y pendiente de regularizar, vencido o por revisar; los avales de la línea, con su avalista y su vencimiento; y el detalle de los préstamos, descubiertos, prefinanciaciones y cheques que consumen la línea.</w:t>
       </w:r>
     </w:p>
     <w:p>
@@ -1299,6 +1299,31 @@
           <w:szCs w:val="21"/>
         </w:rPr>
         <w:t xml:space="preserve">Desde la pantalla se pueden iniciar todas las operaciones. Se puede cargar un préstamo, que abre la carga del módulo G con el cliente, la línea y el disponible ya completos; cargar una prefinanciación de exportaciones o de importaciones sobre la línea elegida; cargar un descubierto, que abre el módulo F con el vencimiento y el disponible ya completos; renovar un descubierto, que lleva a la pantalla de vencimientos sobre el descubierto elegido; y descontar cheques, que abre el módulo H con los cheques endosados por el cliente. En las líneas en dólares, también se puede solicitar una ampliación por actualización del tipo de cambio. Además, se puede consultar la minuta aprobada, con sus versiones y las acciones ejecutadas, y filtrar y exportar la información por cliente, CUIT, grupo, oficial, producto, estado o vencimiento.</w:t>
+      </w:r>
+    </w:p>
+    <w:p>
+      <w:pPr>
+        <w:pStyle w:val="Heading3"/>
+      </w:pPr>
+      <w:r>
+        <w:rPr>
+          <w:rFonts w:ascii="Calibri" w:cs="Calibri" w:eastAsia="Calibri" w:hAnsi="Calibri"/>
+        </w:rPr>
+        <w:t xml:space="preserve">Las operaciones de la línea</w:t>
+      </w:r>
+    </w:p>
+    <w:p>
+      <w:pPr>
+        <w:spacing w:after="120"/>
+        <w:jc w:val="both"/>
+      </w:pPr>
+      <w:r>
+        <w:rPr>
+          <w:rFonts w:ascii="Calibri" w:cs="Calibri" w:eastAsia="Calibri" w:hAnsi="Calibri"/>
+          <w:sz w:val="21"/>
+          <w:szCs w:val="21"/>
+        </w:rPr>
+        <w:t xml:space="preserve">Desde el monto disponible de cada línea, el usuario puede ver todas las operaciones que la consumen. La lista se ordena por vencimiento, desde la operación con el primer vencimiento hasta la más futura, de modo que se lea en el orden en que la línea se va liberando. De cada operación se muestran el tipo y el monto, la tasa de la operación, la tasa de fondeo asociada según su plazo máximo, la fecha de vencimiento final y el plazo de la operación. Así, en una sola vista se ve qué consume la línea, a qué tasa, con qué costo y hasta cuándo.</w:t>
       </w:r>
     </w:p>
     <w:p>
@@ -1363,7 +1388,7 @@
           <w:sz w:val="21"/>
           <w:szCs w:val="21"/>
         </w:rPr>
-        <w:t xml:space="preserve">Los módulos E a K cubren todo lo que consume una línea activa y la gestión posterior de las operaciones. Comparten tres principios: la operación nace en la pantalla de líneas, o en la de vencimientos si se trata de una renovación; queda asociada a su costo de fondeo; y se valida automáticamente.</w:t>
+        <w:t xml:space="preserve">Los módulos E a L cubren todo lo que consume una línea activa y la gestión posterior de las operaciones. Comparten tres principios: la operación nace en la pantalla de líneas, o en la de vencimientos si se trata de una renovación; queda asociada a su costo de fondeo; y se valida automáticamente.</w:t>
       </w:r>
     </w:p>
     <w:p>
@@ -1844,6 +1869,45 @@
           <w:szCs w:val="21"/>
         </w:rPr>
         <w:t xml:space="preserve">Para solicitar el cambio, el usuario debe adjuntar la adenda que respalda la modificación; sin esa adenda, la solicitud no puede enviarse. Con la nueva estructura propuesta y la adenda adjunta, la solicitud pasa a Activas para su aprobación. Recién con la aprobación de Activas se hace efectivo el cambio de estructura del préstamo, y las nuevas cuotas se reflejan en la pantalla de vencimientos. Cada modificación queda registrada con la tabla anterior, la nueva, la adenda y quién la solicitó y aprobó.</w:t>
+      </w:r>
+    </w:p>
+    <w:p>
+      <w:pPr>
+        <w:pStyle w:val="Heading2"/>
+      </w:pPr>
+      <w:r>
+        <w:rPr>
+          <w:rFonts w:ascii="Calibri" w:cs="Calibri" w:eastAsia="Calibri" w:hAnsi="Calibri"/>
+        </w:rPr>
+        <w:t xml:space="preserve">Módulo L · Cheques por cliente (COELSA)</w:t>
+      </w:r>
+    </w:p>
+    <w:p>
+      <w:pPr>
+        <w:spacing w:after="120"/>
+        <w:jc w:val="both"/>
+      </w:pPr>
+      <w:r>
+        <w:rPr>
+          <w:rFonts w:ascii="Calibri" w:cs="Calibri" w:eastAsia="Calibri" w:hAnsi="Calibri"/>
+          <w:sz w:val="21"/>
+          <w:szCs w:val="21"/>
+        </w:rPr>
+        <w:t xml:space="preserve">El objetivo de este módulo es incorporar un apartado nuevo para consultar, cliente por cliente, la información de sus cheques registrada en COELSA, sin salir de la aplicación. La consulta se podrá hacer buscando al cliente por CUIT o razón social, o directamente desde la pantalla de líneas, y su resultado se mostrará en una pantalla propia, separada del circuito de descuento de cheques.</w:t>
+      </w:r>
+    </w:p>
+    <w:p>
+      <w:pPr>
+        <w:spacing w:after="120"/>
+        <w:jc w:val="both"/>
+      </w:pPr>
+      <w:r>
+        <w:rPr>
+          <w:rFonts w:ascii="Calibri" w:cs="Calibri" w:eastAsia="Calibri" w:hAnsi="Calibri"/>
+          <w:sz w:val="21"/>
+          <w:szCs w:val="21"/>
+        </w:rPr>
+        <w:t xml:space="preserve">El detalle funcional de este módulo debe completarse con lo pedido en la sesión "VALO | Discovery - Sesión Funcional" del 16 de octubre, cuya transcripción no pudo consultarse porque el banco tiene bloqueado el acceso automático a las transcripciones de Teams.</w:t>
       </w:r>
     </w:p>
     <w:p>
@@ -1961,7 +2025,7 @@
           <w:sz w:val="21"/>
           <w:szCs w:val="21"/>
         </w:rPr>
-        <w:t xml:space="preserve">La pantalla de vencimientos muestra por defecto las próximas dos semanas, con un plazo configurable, y solo permite descargar recibos de operaciones efectivamente cobradas. Las tablas de amortización solo pueden modificarse en préstamos liquidados y activos, sobre las cuotas no cobradas, con la adenda adjunta y con la aprobación de Activas. Por último, en todo el circuito, cada aprobación, cada forzado y cada cambio de tasa queda registrado con usuario y fecha.</w:t>
+        <w:t xml:space="preserve">La pantalla de vencimientos muestra por defecto las próximas dos semanas, con un plazo configurable, y solo permite descargar recibos de operaciones efectivamente cobradas. En la pantalla de líneas, las operaciones de cada línea se muestran ordenadas desde el primer vencimiento hasta el más futuro, con su tasa de operación, su tasa de fondeo, su vencimiento final y su plazo. Las tablas de amortización solo pueden modificarse en préstamos liquidados y activos, sobre las cuotas no cobradas, con la adenda adjunta y con la aprobación de Activas. Por último, en todo el circuito, cada aprobación, cada forzado y cada cambio de tasa queda registrado con usuario y fecha.</w:t>
       </w:r>
     </w:p>
     <w:p>
@@ -2217,7 +2281,7 @@
           <w:sz w:val="21"/>
           <w:szCs w:val="21"/>
         </w:rPr>
-        <w:t xml:space="preserve">La tercera fase, de complementos, incluye los módulos G, H y K. Entrega la carga de préstamos con tablas de amortización, el descuento de cheques con scoring y la modificación de tablas de amortización de préstamos activos. Se deja para el final porque estos módulos requieren un relevamiento adicional o definiciones de terceros, como el desarrollo de modernización.</w:t>
+        <w:t xml:space="preserve">La tercera fase, de complementos, incluye los módulos G, H, K y L. Entrega la carga de préstamos con tablas de amortización, el descuento de cheques con scoring, la modificación de tablas de amortización de préstamos activos y la consulta de cheques por cliente contra COELSA. Se deja para el final porque estos módulos requieren un relevamiento adicional o definiciones de terceros, como el desarrollo de modernización.</w:t>
       </w:r>
     </w:p>
     <w:p>
@@ -2351,7 +2415,7 @@
           <w:sz w:val="21"/>
           <w:szCs w:val="21"/>
         </w:rPr>
-        <w:t xml:space="preserve">También deben definirse los criterios y la auditoría del forzado de alta por parte del gerente de Riesgos o el CEO; y el alcance de la definición de que "todo lo que está en Trámites y Gestión pase por COBIS Web", para confirmar si incluye otros productos. Por último, este informe debe contrastarse con la transcripción de la reunión del 7 de octubre, que hay que descargar desde Teams.</w:t>
+        <w:t xml:space="preserve">También deben definirse los criterios y la auditoría del forzado de alta por parte del gerente de Riesgos o el CEO; y el alcance de la definición de que "todo lo que está en Trámites y Gestión pase por COBIS Web", para confirmar si incluye otros productos. Por último, este informe debe contrastarse con las transcripciones de las reuniones del 7 y del 16 de octubre, que hay que descargar desde Teams, en particular para completar el módulo L.</w:t>
       </w:r>
     </w:p>
     <w:p>

</xml_diff>

<commit_message>
Incorporar tablero de oficiales del Discovery 16/10 (módulos L a P)
Co-Authored-By: Claude Opus 5.5 <noreply@anthropic.com>
Claude-Session: https://claude.ai/code/session_01JR48ZtjHAJWp3RfTGUyHxs
</commit_message>
<xml_diff>
--- a/Informe_Nueva_Aplicacion_Gestion_Middle_Office.docx
+++ b/Informe_Nueva_Aplicacion_Gestion_Middle_Office.docx
@@ -304,6 +304,20 @@
     </w:p>
     <w:p>
       <w:pPr>
+        <w:spacing w:after="120"/>
+        <w:jc w:val="both"/>
+      </w:pPr>
+      <w:r>
+        <w:rPr>
+          <w:rFonts w:ascii="Calibri" w:cs="Calibri" w:eastAsia="Calibri" w:hAnsi="Calibri"/>
+          <w:sz w:val="21"/>
+          <w:szCs w:val="21"/>
+        </w:rPr>
+        <w:t xml:space="preserve">A esto se suma un tablero de oficiales, relevado con los usuarios el 16 de octubre, que reúne en pantallas separadas la información actualizada de cada cliente y de toda la cartera: cheques contra COELSA, saldos y movimientos del día, fondos por ingresar, transferencias, detalle de descubiertos y alertas de vencimientos, embargos y oportunidades comerciales.</w:t>
+      </w:r>
+    </w:p>
+    <w:p>
+      <w:pPr>
         <w:pStyle w:val="Heading2"/>
       </w:pPr>
       <w:r>
@@ -338,7 +352,7 @@
           <w:sz w:val="21"/>
           <w:szCs w:val="21"/>
         </w:rPr>
-        <w:t xml:space="preserve">A eso se suman controles automáticos en cada operación, la certeza de que ninguna operación se otorga por debajo de la tasa mínima y de que cada una conoce su costo de fondeo, y una trazabilidad completa de minutas, versiones, aprobaciones, excepciones y cambios de tasa. Cada uno de estos resultados tiene un indicador asociado, que se detalla en la sección 8.</w:t>
+        <w:t xml:space="preserve">A eso se suman controles automáticos en cada operación, la certeza de que ninguna operación se otorga por debajo de la tasa mínima y de que cada una conoce su costo de fondeo, y una trazabilidad completa de minutas, versiones, aprobaciones, excepciones y cambios de tasa. Cada uno de estos resultados tiene un indicador asociado, que se detalla en la sección 9.</w:t>
       </w:r>
     </w:p>
     <w:p>
@@ -381,7 +395,7 @@
           <w:sz w:val="21"/>
           <w:szCs w:val="21"/>
         </w:rPr>
-        <w:t xml:space="preserve">Aprobar el alcance de los doce módulos que se describen en este informe.</w:t>
+        <w:t xml:space="preserve">Aprobar el alcance de los dieciséis módulos que se describen en este informe.</w:t>
       </w:r>
     </w:p>
     <w:p>
@@ -909,7 +923,7 @@
           <w:sz w:val="21"/>
           <w:szCs w:val="21"/>
         </w:rPr>
-        <w:t xml:space="preserve">El proyecto se organiza en doce módulos, identificados con las letras A a L, que se agrupan en dos bloques.</w:t>
+        <w:t xml:space="preserve">El proyecto se organiza en dieciséis módulos, identificados con las letras A a P, que se agrupan en tres bloques.</w:t>
       </w:r>
     </w:p>
     <w:p>
@@ -937,7 +951,21 @@
           <w:sz w:val="21"/>
           <w:szCs w:val="21"/>
         </w:rPr>
-        <w:t xml:space="preserve">El segundo bloque reúne los módulos que se apoyan en la línea activa. El módulo E es el costeo de las operaciones, donde Mesa carga el costo de fondeo por plazo y las tasas mínimas. El módulo F cubre las operaciones de descubierto. El módulo G es la carga de préstamos. El módulo H es el descuento de cheques. El módulo I es la pantalla de vencimientos, que incluye la renovación de descubiertos y la descarga de recibos. El módulo J reúne el seguimiento y los reportes. El módulo K, también nuevo, permite modificar las tablas de amortización de préstamos activos. Por último, el módulo L incorpora un apartado para consultar los cheques de cada cliente contra COELSA.</w:t>
+        <w:t xml:space="preserve">El segundo bloque reúne los módulos que se apoyan en la línea activa. El módulo E es el costeo de las operaciones, donde Mesa carga el costo de fondeo por plazo y las tasas mínimas. El módulo F cubre las operaciones de descubierto. El módulo G es la carga de préstamos. El módulo H es el descuento de cheques. El módulo I es la pantalla de vencimientos, que incluye la renovación de descubiertos y la descarga de recibos. El módulo J reúne el seguimiento y los reportes. El módulo K, también nuevo, permite modificar las tablas de amortización de préstamos activos. </w:t>
+      </w:r>
+    </w:p>
+    <w:p>
+      <w:pPr>
+        <w:spacing w:after="120"/>
+        <w:jc w:val="both"/>
+      </w:pPr>
+      <w:r>
+        <w:rPr>
+          <w:rFonts w:ascii="Calibri" w:cs="Calibri" w:eastAsia="Calibri" w:hAnsi="Calibri"/>
+          <w:sz w:val="21"/>
+          <w:szCs w:val="21"/>
+        </w:rPr>
+        <w:t xml:space="preserve">El tercer bloque surge de la sesión "VALO | Discovery - Sesión Funcional" del 16 de octubre, en la que Red Bee relevó con los oficiales la necesidad de centralizar la información actualizada de los clientes para que oficiales y Middle Office consulten carteras, productos, saldos y eventos sin depender de COBIS ni de consultas manuales. Esas necesidades se ordenan en pantallas separadas que forman un tablero de oficiales: el módulo L muestra los cheques de cada cliente contra COELSA; el módulo M, la visión consolidada del cliente; el módulo N, los fondos entrantes y las transferencias; el módulo O, el detalle diario de los descubiertos y los acuerdos con fecha valor; y el módulo P, los eventos, las alertas y las oportunidades comerciales. Todas comparten un mismo criterio: cada pantalla ofrece una vista por cliente y una vista por funcionalidad para toda la cartera.</w:t>
       </w:r>
     </w:p>
     <w:p>
@@ -1284,7 +1312,7 @@
           <w:sz w:val="21"/>
           <w:szCs w:val="21"/>
         </w:rPr>
-        <w:t xml:space="preserve">Para cada línea, la pantalla muestra el cliente, su CUIT y su grupo económico según COBIS MIS; el producto, los subproductos y su plazo, la moneda, la minuta que aprobó la línea y su fecha de revisión; el monto aprobado, lo que consumen las operaciones vigentes y lo que queda disponible; el uso del grupo económico respecto del 15% de la RPC del banco, con una alerta cuando se acerca al límite; los vencimientos de la línea y de sus operaciones; la cantidad de días que le quedan disponibles a la línea hasta su vencimiento; el estado de cada subproducto, que puede estar activo, pendiente de garantía, forzado y pendiente de regularizar, vencido o por revisar; los avales de la línea, con su avalista y su vencimiento; y el detalle de los préstamos, descubiertos, prefinanciaciones y cheques que consumen la línea.</w:t>
+        <w:t xml:space="preserve">Para cada línea, la pantalla muestra el cliente, su CUIT y su grupo económico según COBIS MIS; el producto, los subproductos y su plazo, la moneda, la minuta que aprobó la línea y su fecha de revisión; el monto aprobado, lo que consumen las operaciones vigentes y lo que queda disponible; el uso del grupo económico respecto del 15% de la RPC del banco, con una alerta cuando se acerca al límite; los vencimientos de la línea y de sus operaciones; la cantidad de días que le quedan disponibles a la línea hasta su vencimiento; el plazo permitido de cada sublímite, que puede ser distinto al de la línea, con una alerta unos 60 días antes de su vencimiento; el estado de cada subproducto, que puede estar activo, pendiente de garantía, forzado y pendiente de regularizar, vencido o por revisar; los avales de la línea, con su avalista y su vencimiento; y el detalle de los préstamos, descubiertos, prefinanciaciones y cheques que consumen la línea.</w:t>
       </w:r>
     </w:p>
     <w:p>
@@ -1388,7 +1416,7 @@
           <w:sz w:val="21"/>
           <w:szCs w:val="21"/>
         </w:rPr>
-        <w:t xml:space="preserve">Los módulos E a L cubren todo lo que consume una línea activa y la gestión posterior de las operaciones. Comparten tres principios: la operación nace en la pantalla de líneas, o en la de vencimientos si se trata de una renovación; queda asociada a su costo de fondeo; y se valida automáticamente.</w:t>
+        <w:t xml:space="preserve">Los módulos E a K cubren todo lo que consume una línea activa y la gestión posterior de las operaciones. Comparten tres principios: la operación nace en la pantalla de líneas, o en la de vencimientos si se trata de una renovación; queda asociada a su costo de fondeo; y se valida automáticamente.</w:t>
       </w:r>
     </w:p>
     <w:p>
@@ -1869,45 +1897,6 @@
           <w:szCs w:val="21"/>
         </w:rPr>
         <w:t xml:space="preserve">Para solicitar el cambio, el usuario debe adjuntar la adenda que respalda la modificación; sin esa adenda, la solicitud no puede enviarse. Con la nueva estructura propuesta y la adenda adjunta, la solicitud pasa a Activas para su aprobación. Recién con la aprobación de Activas se hace efectivo el cambio de estructura del préstamo, y las nuevas cuotas se reflejan en la pantalla de vencimientos. Cada modificación queda registrada con la tabla anterior, la nueva, la adenda y quién la solicitó y aprobó.</w:t>
-      </w:r>
-    </w:p>
-    <w:p>
-      <w:pPr>
-        <w:pStyle w:val="Heading2"/>
-      </w:pPr>
-      <w:r>
-        <w:rPr>
-          <w:rFonts w:ascii="Calibri" w:cs="Calibri" w:eastAsia="Calibri" w:hAnsi="Calibri"/>
-        </w:rPr>
-        <w:t xml:space="preserve">Módulo L · Cheques por cliente (COELSA)</w:t>
-      </w:r>
-    </w:p>
-    <w:p>
-      <w:pPr>
-        <w:spacing w:after="120"/>
-        <w:jc w:val="both"/>
-      </w:pPr>
-      <w:r>
-        <w:rPr>
-          <w:rFonts w:ascii="Calibri" w:cs="Calibri" w:eastAsia="Calibri" w:hAnsi="Calibri"/>
-          <w:sz w:val="21"/>
-          <w:szCs w:val="21"/>
-        </w:rPr>
-        <w:t xml:space="preserve">El objetivo de este módulo es incorporar un apartado nuevo para consultar, cliente por cliente, la información de sus cheques registrada en COELSA, sin salir de la aplicación. La consulta se podrá hacer buscando al cliente por CUIT o razón social, o directamente desde la pantalla de líneas, y su resultado se mostrará en una pantalla propia, separada del circuito de descuento de cheques.</w:t>
-      </w:r>
-    </w:p>
-    <w:p>
-      <w:pPr>
-        <w:spacing w:after="120"/>
-        <w:jc w:val="both"/>
-      </w:pPr>
-      <w:r>
-        <w:rPr>
-          <w:rFonts w:ascii="Calibri" w:cs="Calibri" w:eastAsia="Calibri" w:hAnsi="Calibri"/>
-          <w:sz w:val="21"/>
-          <w:szCs w:val="21"/>
-        </w:rPr>
-        <w:t xml:space="preserve">El detalle funcional de este módulo debe completarse con lo pedido en la sesión "VALO | Discovery - Sesión Funcional" del 16 de octubre, cuya transcripción no pudo consultarse porque el banco tiene bloqueado el acceso automático a las transcripciones de Teams.</w:t>
       </w:r>
     </w:p>
     <w:p>
@@ -1919,208 +1908,283 @@
         <w:rPr>
           <w:rFonts w:ascii="Calibri" w:cs="Calibri" w:eastAsia="Calibri" w:hAnsi="Calibri"/>
         </w:rPr>
-        <w:t xml:space="preserve">7. Reglas de negocio y responsabilidades</w:t>
-      </w:r>
-    </w:p>
-    <w:p>
-      <w:pPr>
-        <w:spacing w:after="120"/>
-        <w:jc w:val="both"/>
-      </w:pPr>
-      <w:r>
-        <w:rPr>
-          <w:rFonts w:ascii="Calibri" w:cs="Calibri" w:eastAsia="Calibri" w:hAnsi="Calibri"/>
-          <w:sz w:val="21"/>
-          <w:szCs w:val="21"/>
-        </w:rPr>
-        <w:t xml:space="preserve">El sistema debe asegurar un conjunto de reglas de negocio. Cada una reemplaza un control que hoy es manual o que directamente no existe.</w:t>
-      </w:r>
-    </w:p>
-    <w:p>
-      <w:pPr>
-        <w:pStyle w:val="Heading2"/>
-      </w:pPr>
-      <w:r>
-        <w:rPr>
-          <w:rFonts w:ascii="Calibri" w:cs="Calibri" w:eastAsia="Calibri" w:hAnsi="Calibri"/>
-        </w:rPr>
-        <w:t xml:space="preserve">Reglas sobre la minuta y la línea</w:t>
-      </w:r>
-    </w:p>
-    <w:p>
-      <w:pPr>
-        <w:spacing w:after="120"/>
-        <w:jc w:val="both"/>
-      </w:pPr>
-      <w:r>
-        <w:rPr>
-          <w:rFonts w:ascii="Calibri" w:cs="Calibri" w:eastAsia="Calibri" w:hAnsi="Calibri"/>
-          <w:sz w:val="21"/>
-          <w:szCs w:val="21"/>
-        </w:rPr>
-        <w:t xml:space="preserve">La minuta no se puede aprobar sin oficial y CUIT. Su aprobación dispara las acciones automáticas, y si alguna falla, queda pendiente y visible para que se resuelva. El aprobador comercial se determina según el oficial de la minuta. La instancia de aprobación depende de la línea: van al subcomité las líneas de hasta USD 1.000.000, las corporativas de hasta $1.000 millones y las de ALyC; el resto va al comité.</w:t>
-      </w:r>
-    </w:p>
-    <w:p>
-      <w:pPr>
-        <w:spacing w:after="120"/>
-        <w:jc w:val="both"/>
-      </w:pPr>
-      <w:r>
-        <w:rPr>
-          <w:rFonts w:ascii="Calibri" w:cs="Calibri" w:eastAsia="Calibri" w:hAnsi="Calibri"/>
-          <w:sz w:val="21"/>
-          <w:szCs w:val="21"/>
-        </w:rPr>
-        <w:t xml:space="preserve">En cuanto a las garantías de la línea, solo los subproductos que las requieren quedan pendientes hasta la conformidad de Activas, salvo que el gerente de Riesgos o el CEO fuercen el alta con regularización posterior. Los demás subproductos se impactan con la aprobación del comité. Una línea garantizada puede tener uno o más avales, cada uno con su vencimiento y con un avalista que debe estar en COBIS MIS; los documentos de los avales se adjuntan solo a modo informativo, y la conformidad de Activas deja la línea en vigencia y registra el aval en las garantías de COBIS. Las líneas en dólares solo se amplían por actualización del tipo de cambio a pedido de Middle Office y con la autorización del gerente de Riesgos.</w:t>
-      </w:r>
-    </w:p>
-    <w:p>
-      <w:pPr>
-        <w:pStyle w:val="Heading2"/>
-      </w:pPr>
-      <w:r>
-        <w:rPr>
-          <w:rFonts w:ascii="Calibri" w:cs="Calibri" w:eastAsia="Calibri" w:hAnsi="Calibri"/>
-        </w:rPr>
-        <w:t xml:space="preserve">Reglas sobre las operaciones</w:t>
-      </w:r>
-    </w:p>
-    <w:p>
-      <w:pPr>
-        <w:spacing w:after="120"/>
-        <w:jc w:val="both"/>
-      </w:pPr>
-      <w:r>
-        <w:rPr>
-          <w:rFonts w:ascii="Calibri" w:cs="Calibri" w:eastAsia="Calibri" w:hAnsi="Calibri"/>
-          <w:sz w:val="21"/>
-          <w:szCs w:val="21"/>
-        </w:rPr>
-        <w:t xml:space="preserve">Toda operación se inicia desde una línea vigente en la pantalla de líneas, salvo las renovaciones, que se inician desde la pantalla de vencimientos. En cada operación, la suma de las operaciones del grupo no puede superar la línea aprobada y ningún grupo puede superar el 15% de la RPC del banco, calculada según la normativa del BCRA sobre grandes exposiciones al riesgo de crédito (punto 2.1). Cada operación, al cargarse o renovarse, queda asociada al costo de fondeo del plazo máximo otorgado, y su tasa debe ser superior a la tasa mínima cargada por Mesa. Cuando una operación lleva garantía, su alta queda condicionada a la conformidad de Activas.</w:t>
-      </w:r>
-    </w:p>
-    <w:p>
-      <w:pPr>
-        <w:spacing w:after="120"/>
-        <w:jc w:val="both"/>
-      </w:pPr>
-      <w:r>
-        <w:rPr>
-          <w:rFonts w:ascii="Calibri" w:cs="Calibri" w:eastAsia="Calibri" w:hAnsi="Calibri"/>
-          <w:sz w:val="21"/>
-          <w:szCs w:val="21"/>
-        </w:rPr>
-        <w:t xml:space="preserve">Hay además reglas específicas por tipo de operación. En los préstamos, la operación se elige por su nombre y no por su código. En los descubiertos, se consumen primero los acuerdos con full numerales y después los demás, y no puede haber un descubierto nuevo si hay otro vigente del mismo tipo. En las renovaciones, se da de baja la operación anterior y se activa la nueva sin pasar por Riesgos; el usuario elige si la renovación es total o con cambio de importe, y si el importe es mayor, el sistema controla la línea al cargar y al adjudicar. En el descuento de cheques, se aceptan solo los cheques aprobados por el scoring o por Riesgos; sin tasa de descuento precargada no se puede simular; y Activas aprueba el acuerdo marco una sola vez, después de lo cual el desembolso es automático.</w:t>
-      </w:r>
-    </w:p>
-    <w:p>
-      <w:pPr>
-        <w:spacing w:after="120"/>
-        <w:jc w:val="both"/>
-      </w:pPr>
-      <w:r>
-        <w:rPr>
-          <w:rFonts w:ascii="Calibri" w:cs="Calibri" w:eastAsia="Calibri" w:hAnsi="Calibri"/>
-          <w:sz w:val="21"/>
-          <w:szCs w:val="21"/>
-        </w:rPr>
-        <w:t xml:space="preserve">La pantalla de vencimientos muestra por defecto las próximas dos semanas, con un plazo configurable, y solo permite descargar recibos de operaciones efectivamente cobradas. En la pantalla de líneas, las operaciones de cada línea se muestran ordenadas desde el primer vencimiento hasta el más futuro, con su tasa de operación, su tasa de fondeo, su vencimiento final y su plazo. Las tablas de amortización solo pueden modificarse en préstamos liquidados y activos, sobre las cuotas no cobradas, con la adenda adjunta y con la aprobación de Activas. Por último, en todo el circuito, cada aprobación, cada forzado y cada cambio de tasa queda registrado con usuario y fecha.</w:t>
-      </w:r>
-    </w:p>
-    <w:p>
-      <w:pPr>
-        <w:pStyle w:val="Heading2"/>
-      </w:pPr>
-      <w:r>
-        <w:rPr>
-          <w:rFonts w:ascii="Calibri" w:cs="Calibri" w:eastAsia="Calibri" w:hAnsi="Calibri"/>
-        </w:rPr>
-        <w:t xml:space="preserve">Responsabilidades por área</w:t>
-      </w:r>
-    </w:p>
-    <w:p>
-      <w:pPr>
-        <w:spacing w:after="120"/>
-        <w:jc w:val="both"/>
-      </w:pPr>
-      <w:r>
-        <w:rPr>
-          <w:rFonts w:ascii="Calibri" w:cs="Calibri" w:eastAsia="Calibri" w:hAnsi="Calibri"/>
-          <w:sz w:val="21"/>
-          <w:szCs w:val="21"/>
-        </w:rPr>
-        <w:t xml:space="preserve">La propuesta de responsabilidades, que debe validarse con las áreas, es la siguiente.</w:t>
-      </w:r>
-    </w:p>
-    <w:p>
-      <w:pPr>
-        <w:spacing w:after="120"/>
-        <w:jc w:val="both"/>
-      </w:pPr>
-      <w:r>
-        <w:rPr>
-          <w:rFonts w:ascii="Calibri" w:cs="Calibri" w:eastAsia="Calibri" w:hAnsi="Calibri"/>
-          <w:sz w:val="21"/>
-          <w:szCs w:val="21"/>
-        </w:rPr>
-        <w:t xml:space="preserve">Riesgo de Crédito carga y edita el borrador de la minuta, con la participación del gerente de Riesgos. También revisa las excepciones de las operaciones y aprueba los cheques que se quieren forzar fuera del scoring. La aprobación de la minuta está a cargo del gerente de Riesgos, el CEO y el gerente comercial que corresponda según el oficial. El CEO firma por DocuSign las minutas del subcomité. El gerente de Riesgos y el CEO son los únicos que pueden forzar el alta de un subproducto con garantía pendiente. El gerente de Riesgos, además, autoriza las ampliaciones de las líneas en dólares por actualización del tipo de cambio.</w:t>
-      </w:r>
-    </w:p>
-    <w:p>
-      <w:pPr>
-        <w:spacing w:after="120"/>
-        <w:jc w:val="both"/>
-      </w:pPr>
-      <w:r>
-        <w:rPr>
-          <w:rFonts w:ascii="Calibri" w:cs="Calibri" w:eastAsia="Calibri" w:hAnsi="Calibri"/>
-          <w:sz w:val="21"/>
-          <w:szCs w:val="21"/>
-        </w:rPr>
-        <w:t xml:space="preserve">Middle Office es el área que opera. Detalla los avales de las líneas garantizadas y adjunta las fianzas generales; solicita las ampliaciones de las líneas en dólares; carga los préstamos, las prefinanciaciones y los descubiertos; renueva los descubiertos desde la pantalla de vencimientos; carga y simula los descuentos de cheques; y solicita las modificaciones de tablas de amortización.</w:t>
-      </w:r>
-    </w:p>
-    <w:p>
-      <w:pPr>
-        <w:spacing w:after="120"/>
-        <w:jc w:val="both"/>
-      </w:pPr>
-      <w:r>
-        <w:rPr>
-          <w:rFonts w:ascii="Calibri" w:cs="Calibri" w:eastAsia="Calibri" w:hAnsi="Calibri"/>
-          <w:sz w:val="21"/>
-          <w:szCs w:val="21"/>
-        </w:rPr>
-        <w:t xml:space="preserve">Activas otorga la conformidad de las garantías; autoriza los avales, con lo que deja la línea en vigencia y los registra en las garantías de COBIS; aprueba el acuerdo marco de cheques, con la parametrización de la cuenta de desembolso; y aprueba las modificaciones de tablas de amortización. Mesa carga y mantiene el costo de fondeo por plazo y las tasas mínimas.</w:t>
-      </w:r>
-    </w:p>
-    <w:p>
-      <w:pPr>
-        <w:spacing w:after="120"/>
-        <w:jc w:val="both"/>
-      </w:pPr>
-      <w:r>
-        <w:rPr>
-          <w:rFonts w:ascii="Calibri" w:cs="Calibri" w:eastAsia="Calibri" w:hAnsi="Calibri"/>
-          <w:sz w:val="21"/>
-          <w:szCs w:val="21"/>
-        </w:rPr>
-        <w:t xml:space="preserve">Todas las áreas involucradas pueden consultar las pantallas, el seguimiento y los reportes.</w:t>
-      </w:r>
-    </w:p>
-    <w:p>
-      <w:pPr>
-        <w:spacing w:after="120"/>
-        <w:jc w:val="both"/>
-      </w:pPr>
-      <w:r>
-        <w:rPr>
-          <w:rFonts w:ascii="Calibri" w:cs="Calibri" w:eastAsia="Calibri" w:hAnsi="Calibri"/>
-          <w:sz w:val="21"/>
-          <w:szCs w:val="21"/>
-        </w:rPr>
-        <w:t xml:space="preserve">Participan también otros actores. Red BI tiene a su cargo el desarrollo en COBIS Web. El equipo del desarrollo de modernización debe integrar el scoring de cheques. Y Sistemas y Operaciones, con Daniel Semino y Jonathan Domínguez, están a cargo del relevamiento, la coordinación y el seguimiento del proyecto.</w:t>
+        <w:t xml:space="preserve">7. Tablero de oficiales: pantallas surgidas del Discovery</w:t>
+      </w:r>
+    </w:p>
+    <w:p>
+      <w:pPr>
+        <w:spacing w:after="120"/>
+        <w:jc w:val="both"/>
+      </w:pPr>
+      <w:r>
+        <w:rPr>
+          <w:rFonts w:ascii="Calibri" w:cs="Calibri" w:eastAsia="Calibri" w:hAnsi="Calibri"/>
+          <w:sz w:val="21"/>
+          <w:szCs w:val="21"/>
+        </w:rPr>
+        <w:t xml:space="preserve">Los módulos L a P responden a lo relevado con los oficiales el 16 de octubre. El punto de partida es que hoy la información de los clientes existe en distintos lugares pero no está accesible de forma integrada, y que los tableros actuales se alimentan con datos del día anterior: para ver saldos y movimientos del día hay que entrar a COBIS. El objetivo es una capa de visualización con datos actuales que permita decidir con información y, más adelante, habilitar acciones sobre ella.</w:t>
+      </w:r>
+    </w:p>
+    <w:p>
+      <w:pPr>
+        <w:pStyle w:val="Heading2"/>
+      </w:pPr>
+      <w:r>
+        <w:rPr>
+          <w:rFonts w:ascii="Calibri" w:cs="Calibri" w:eastAsia="Calibri" w:hAnsi="Calibri"/>
+        </w:rPr>
+        <w:t xml:space="preserve">Módulo L · Cheques por cliente (COELSA)</w:t>
+      </w:r>
+    </w:p>
+    <w:p>
+      <w:pPr>
+        <w:spacing w:after="120"/>
+        <w:jc w:val="both"/>
+      </w:pPr>
+      <w:r>
+        <w:rPr>
+          <w:rFonts w:ascii="Calibri" w:cs="Calibri" w:eastAsia="Calibri" w:hAnsi="Calibri"/>
+          <w:sz w:val="21"/>
+          <w:szCs w:val="21"/>
+        </w:rPr>
+        <w:t xml:space="preserve">El objetivo de este módulo es que el oficial y Middle Office vean en una pantalla propia la situación de los cheques de cada cliente, consultada contra COELSA, sin pedir información por otros canales. La pantalla muestra los cheques pendientes de cobro, es decir, los depositados que todavía no se acreditaron; los cheques que están en cámara; y los cheques emitidos o aceptados en COELSA. También señala, como oportunidad comercial, los cheques del cliente que podrían comprarse o descontarse a través del módulo H.</w:t>
+      </w:r>
+    </w:p>
+    <w:p>
+      <w:pPr>
+        <w:spacing w:after="120"/>
+        <w:jc w:val="both"/>
+      </w:pPr>
+      <w:r>
+        <w:rPr>
+          <w:rFonts w:ascii="Calibri" w:cs="Calibri" w:eastAsia="Calibri" w:hAnsi="Calibri"/>
+          <w:sz w:val="21"/>
+          <w:szCs w:val="21"/>
+        </w:rPr>
+        <w:t xml:space="preserve">La pantalla tiene dos vistas: una por cliente, a la que también se llega desde la pantalla de líneas y desde la visión consolidada, y otra para toda la cartera, por ejemplo con todos los cheques por acreditar de los clientes de un oficial. Esta información ayuda a decidir si se libera un pago, pero un cheque no acreditado no se considera cobrado ni libera fondos automáticamente.</w:t>
+      </w:r>
+    </w:p>
+    <w:p>
+      <w:pPr>
+        <w:pStyle w:val="Heading2"/>
+      </w:pPr>
+      <w:r>
+        <w:rPr>
+          <w:rFonts w:ascii="Calibri" w:cs="Calibri" w:eastAsia="Calibri" w:hAnsi="Calibri"/>
+        </w:rPr>
+        <w:t xml:space="preserve">Módulo M · Visión consolidada del cliente</w:t>
+      </w:r>
+    </w:p>
+    <w:p>
+      <w:pPr>
+        <w:spacing w:after="120"/>
+        <w:jc w:val="both"/>
+      </w:pPr>
+      <w:r>
+        <w:rPr>
+          <w:rFonts w:ascii="Calibri" w:cs="Calibri" w:eastAsia="Calibri" w:hAnsi="Calibri"/>
+          <w:sz w:val="21"/>
+          <w:szCs w:val="21"/>
+        </w:rPr>
+        <w:t xml:space="preserve">El objetivo de este módulo es reunir toda la información del cliente en un solo lugar y con datos del día. La pantalla muestra las líneas aprobadas y sus sublímites, con el plazo permitido de cada uno; las operaciones vigentes, con su tipo, tasa, monto y vencimiento; las cuentas abiertas y sus firmantes; los saldos históricos e intradía y los movimientos del día; y el estado de las cuentas, incluidos los embargos y bloqueos.</w:t>
+      </w:r>
+    </w:p>
+    <w:p>
+      <w:pPr>
+        <w:spacing w:after="120"/>
+        <w:jc w:val="both"/>
+      </w:pPr>
+      <w:r>
+        <w:rPr>
+          <w:rFonts w:ascii="Calibri" w:cs="Calibri" w:eastAsia="Calibri" w:hAnsi="Calibri"/>
+          <w:sz w:val="21"/>
+          <w:szCs w:val="21"/>
+        </w:rPr>
+        <w:t xml:space="preserve">Incluye además el seguimiento de los desembolsos. Hoy Middle Office puede cargar un préstamo sin enterarse de que se desembolsó o de que se acreditaron los fondos, y tiene que preguntar. Con esta pantalla, cuando la operación se ejecuta, se ven el movimiento, la acreditación y el comprobante o resumen de la operación. El cliente se busca preferentemente por nombre, y también por CUIT, razón social o número de cuenta.</w:t>
+      </w:r>
+    </w:p>
+    <w:p>
+      <w:pPr>
+        <w:pStyle w:val="Heading2"/>
+      </w:pPr>
+      <w:r>
+        <w:rPr>
+          <w:rFonts w:ascii="Calibri" w:cs="Calibri" w:eastAsia="Calibri" w:hAnsi="Calibri"/>
+        </w:rPr>
+        <w:t xml:space="preserve">Módulo N · Fondos entrantes y transferencias</w:t>
+      </w:r>
+    </w:p>
+    <w:p>
+      <w:pPr>
+        <w:spacing w:after="120"/>
+        <w:jc w:val="both"/>
+      </w:pPr>
+      <w:r>
+        <w:rPr>
+          <w:rFonts w:ascii="Calibri" w:cs="Calibri" w:eastAsia="Calibri" w:hAnsi="Calibri"/>
+          <w:sz w:val="21"/>
+          <w:szCs w:val="21"/>
+        </w:rPr>
+        <w:t xml:space="preserve">El objetivo de este módulo es dar visibilidad sobre lo que está por entrar y por salir, para operar un banco más transaccional. Hoy se pueden revisar desembolsos aislados, pero al decidir si se libera un pago hace falta ver no solo lo prestado y lo disponible, sino también los fondos que están por ingresar.</w:t>
+      </w:r>
+    </w:p>
+    <w:p>
+      <w:pPr>
+        <w:spacing w:after="120"/>
+        <w:jc w:val="both"/>
+      </w:pPr>
+      <w:r>
+        <w:rPr>
+          <w:rFonts w:ascii="Calibri" w:cs="Calibri" w:eastAsia="Calibri" w:hAnsi="Calibri"/>
+          <w:sz w:val="21"/>
+          <w:szCs w:val="21"/>
+        </w:rPr>
+        <w:t xml:space="preserve">La pantalla muestra las transferencias cargadas o pendientes de autorización en los dos home banking, con su cantidad, destino y monto, y en el detalle, el CBU y el concepto; también sus estados, como encolada, cancelada o rechazada con su motivo. Muestra los rescates de fondos pendientes, que se liquidan en T+1, y la fecha en que ingresarán los fondos, ya sea que se hayan cargado por Hirus o por Virtual Broker. Incluye las liquidaciones de Comercio Exterior y las operaciones de cambios concertadas por la Mesa que están pendientes de liquidación, además de los cheques depositados pendientes de acreditación.</w:t>
+      </w:r>
+    </w:p>
+    <w:p>
+      <w:pPr>
+        <w:spacing w:after="120"/>
+        <w:jc w:val="both"/>
+      </w:pPr>
+      <w:r>
+        <w:rPr>
+          <w:rFonts w:ascii="Calibri" w:cs="Calibri" w:eastAsia="Calibri" w:hAnsi="Calibri"/>
+          <w:sz w:val="21"/>
+          <w:szCs w:val="21"/>
+        </w:rPr>
+        <w:t xml:space="preserve">Lo pendiente se muestra para que quien aprueba decida con información, pero no se considera cobrado ni libera fondos de forma automática. La pantalla permite relacionar los ingresos con los pagos próximos, evitar llamadas al cliente y priorizar pedidos según caja y urgencia; los adelantos siguen sujetos a límites y autorizaciones.</w:t>
+      </w:r>
+    </w:p>
+    <w:p>
+      <w:pPr>
+        <w:pStyle w:val="Heading2"/>
+      </w:pPr>
+      <w:r>
+        <w:rPr>
+          <w:rFonts w:ascii="Calibri" w:cs="Calibri" w:eastAsia="Calibri" w:hAnsi="Calibri"/>
+        </w:rPr>
+        <w:t xml:space="preserve">Módulo O · Descubiertos: detalle diario y fecha valor</w:t>
+      </w:r>
+    </w:p>
+    <w:p>
+      <w:pPr>
+        <w:spacing w:after="120"/>
+        <w:jc w:val="both"/>
+      </w:pPr>
+      <w:r>
+        <w:rPr>
+          <w:rFonts w:ascii="Calibri" w:cs="Calibri" w:eastAsia="Calibri" w:hAnsi="Calibri"/>
+          <w:sz w:val="21"/>
+          <w:szCs w:val="21"/>
+        </w:rPr>
+        <w:t xml:space="preserve">El objetivo de este módulo es poner a disposición información que hoy llega en PDF o por chat. La pantalla muestra el detalle diario de los descubiertos, con las tasas aplicadas, los vencimientos y los intereses cobrados.</w:t>
+      </w:r>
+    </w:p>
+    <w:p>
+      <w:pPr>
+        <w:spacing w:after="120"/>
+        <w:jc w:val="both"/>
+      </w:pPr>
+      <w:r>
+        <w:rPr>
+          <w:rFonts w:ascii="Calibri" w:cs="Calibri" w:eastAsia="Calibri" w:hAnsi="Calibri"/>
+          <w:sz w:val="21"/>
+          <w:szCs w:val="21"/>
+        </w:rPr>
+        <w:t xml:space="preserve">Se evalúa además habilitar acuerdos con fecha valor, para corregir un descubierto originado en un error operativo sin ajustes manuales posteriores. Se proponen límites por monto y por nivel de aprobación, y la política contempla hasta tres días a nivel de movimiento y cinco a nivel contable, sujeto a validación. Su viabilidad, con sus controles y el cálculo del cobro, la revisan Adrián Porto y Daniel Semino con Cristian.</w:t>
+      </w:r>
+    </w:p>
+    <w:p>
+      <w:pPr>
+        <w:spacing w:after="120"/>
+        <w:jc w:val="both"/>
+      </w:pPr>
+      <w:r>
+        <w:rPr>
+          <w:rFonts w:ascii="Calibri" w:cs="Calibri" w:eastAsia="Calibri" w:hAnsi="Calibri"/>
+          <w:sz w:val="21"/>
+          <w:szCs w:val="21"/>
+        </w:rPr>
+        <w:t xml:space="preserve">Por último, se propone registrar el histórico diario de la tasa de transferencia, que es distinta de la tasa de fondeo y que hoy se recibe por chat y se carga a mano. Ese histórico permitiría consultar la tasa vigente en una fecha anterior para los acuerdos con fecha valor y calcular el margen de una operación. Dónde registrarla se define con la Mesa.</w:t>
+      </w:r>
+    </w:p>
+    <w:p>
+      <w:pPr>
+        <w:pStyle w:val="Heading2"/>
+      </w:pPr>
+      <w:r>
+        <w:rPr>
+          <w:rFonts w:ascii="Calibri" w:cs="Calibri" w:eastAsia="Calibri" w:hAnsi="Calibri"/>
+        </w:rPr>
+        <w:t xml:space="preserve">Módulo P · Eventos, alertas y oportunidades</w:t>
+      </w:r>
+    </w:p>
+    <w:p>
+      <w:pPr>
+        <w:spacing w:after="120"/>
+        <w:jc w:val="both"/>
+      </w:pPr>
+      <w:r>
+        <w:rPr>
+          <w:rFonts w:ascii="Calibri" w:cs="Calibri" w:eastAsia="Calibri" w:hAnsi="Calibri"/>
+          <w:sz w:val="21"/>
+          <w:szCs w:val="21"/>
+        </w:rPr>
+        <w:t xml:space="preserve">El objetivo de este módulo es que el oficial se anticipe sin armar calendarios ni listados manuales. La pantalla muestra los clientes de la cartera con cuentas embargadas o bloqueadas, que hoy se avisan por mail y pueden pasar inadvertidas; los títulos próximos a vencer, cruzando la especie con los comitentes de cada oficial, para proponer una renovación o reinversión; y los plazos fijos que vencen en los próximos 30 días, con clientes y montos, que hoy se piden al SAC de forma manual.</w:t>
+      </w:r>
+    </w:p>
+    <w:p>
+      <w:pPr>
+        <w:spacing w:after="120"/>
+        <w:jc w:val="both"/>
+      </w:pPr>
+      <w:r>
+        <w:rPr>
+          <w:rFonts w:ascii="Calibri" w:cs="Calibri" w:eastAsia="Calibri" w:hAnsi="Calibri"/>
+          <w:sz w:val="21"/>
+          <w:szCs w:val="21"/>
+        </w:rPr>
+        <w:t xml:space="preserve">También avisa cuando faltan unos 60 días para el vencimiento de una línea o sublínea, para iniciar la renovación, y reúne las oportunidades de la cartera: clientes con línea disponible, cheques para comprar o descontar, títulos por vencer y liquidaciones pendientes. Las alertas deben ser puntuales, porque una alerta permanente pierde efectividad.</w:t>
+      </w:r>
+    </w:p>
+    <w:p>
+      <w:pPr>
+        <w:pStyle w:val="Heading2"/>
+      </w:pPr>
+      <w:r>
+        <w:rPr>
+          <w:rFonts w:ascii="Calibri" w:cs="Calibri" w:eastAsia="Calibri" w:hAnsi="Calibri"/>
+        </w:rPr>
+        <w:t xml:space="preserve">Criterios comunes del tablero</w:t>
+      </w:r>
+    </w:p>
+    <w:p>
+      <w:pPr>
+        <w:spacing w:after="120"/>
+        <w:jc w:val="both"/>
+      </w:pPr>
+      <w:r>
+        <w:rPr>
+          <w:rFonts w:ascii="Calibri" w:cs="Calibri" w:eastAsia="Calibri" w:hAnsi="Calibri"/>
+          <w:sz w:val="21"/>
+          <w:szCs w:val="21"/>
+        </w:rPr>
+        <w:t xml:space="preserve">Todas las pantallas del tablero ofrecen una vista por cliente y una vista por funcionalidad para toda la cartera. Los clientes se clasifican según la segmentación existente en COBIS: ALyC, fondos, fideicomisos, corporativos y un grupo reducido de personas físicas vinculadas o empleados. Para los oficiales, la vista es principalmente de consulta; queda por definir si pueden ver toda la información, incluso la cartera de un oficial ausente. Middle Office tiene una vista agregada de todos los oficiales y, a futuro, la capacidad de editar o ejecutar acciones. El relevamiento técnico definirá en qué sistema reside cada dato: COBIS, los home banking, Hirus, Virtual Broker o el sistema de plazos fijos.</w:t>
+      </w:r>
+    </w:p>
+    <w:p>
+      <w:pPr>
+        <w:spacing w:after="120"/>
+        <w:jc w:val="both"/>
+      </w:pPr>
+      <w:r>
+        <w:rPr>
+          <w:rFonts w:ascii="Calibri" w:cs="Calibri" w:eastAsia="Calibri" w:hAnsi="Calibri"/>
+          <w:sz w:val="21"/>
+          <w:szCs w:val="21"/>
+        </w:rPr>
+        <w:t xml:space="preserve">Queda fuera de este alcance la suscripción y el rescate de fondos desde el home banking, que hoy se piden por mail, teléfono o WhatsApp y se procesan a mano. Ese tema se incorpora al backlog del home banking con Red Bee; su primera etapa es el acceso por single sign-on a Comercio Exterior y a la cuenta de títulos por Virtual Broker.</w:t>
       </w:r>
     </w:p>
     <w:p>
@@ -2132,77 +2196,208 @@
         <w:rPr>
           <w:rFonts w:ascii="Calibri" w:cs="Calibri" w:eastAsia="Calibri" w:hAnsi="Calibri"/>
         </w:rPr>
-        <w:t xml:space="preserve">8. Beneficios esperados</w:t>
-      </w:r>
-    </w:p>
-    <w:p>
-      <w:pPr>
-        <w:spacing w:after="120"/>
-        <w:jc w:val="both"/>
-      </w:pPr>
-      <w:r>
-        <w:rPr>
-          <w:rFonts w:ascii="Calibri" w:cs="Calibri" w:eastAsia="Calibri" w:hAnsi="Calibri"/>
-          <w:sz w:val="21"/>
-          <w:szCs w:val="21"/>
-        </w:rPr>
-        <w:t xml:space="preserve">El proyecto genera beneficios concretos y medibles, y para cada uno se propone un indicador que permita seguir su evolución.</w:t>
-      </w:r>
-    </w:p>
-    <w:p>
-      <w:pPr>
-        <w:spacing w:after="120"/>
-        <w:jc w:val="both"/>
-      </w:pPr>
-      <w:r>
-        <w:rPr>
-          <w:rFonts w:ascii="Calibri" w:cs="Calibri" w:eastAsia="Calibri" w:hAnsi="Calibri"/>
-          <w:sz w:val="21"/>
-          <w:szCs w:val="21"/>
-        </w:rPr>
-        <w:t xml:space="preserve">El primer beneficio es la reducción del tiempo de alta de las líneas, que pasa de cinco pasos manuales a una sola aprobación con acciones automáticas. Se medirá con las horas que transcurren entre la aprobación del comité y la línea activa. El segundo es la reducción de los errores de carga, porque la línea sale de la misma minuta aprobada; el indicador será la cantidad de correcciones de líneas por mes.</w:t>
-      </w:r>
-    </w:p>
-    <w:p>
-      <w:pPr>
-        <w:spacing w:after="120"/>
-        <w:jc w:val="both"/>
-      </w:pPr>
-      <w:r>
-        <w:rPr>
-          <w:rFonts w:ascii="Calibri" w:cs="Calibri" w:eastAsia="Calibri" w:hAnsi="Calibri"/>
-          <w:sz w:val="21"/>
-          <w:szCs w:val="21"/>
-        </w:rPr>
-        <w:t xml:space="preserve">El tercer beneficio es el cumplimiento regulatorio, porque el límite del 15% de la RPC se controla en cada operación. Se medirá con la cantidad de operaciones bloqueadas o enviadas como excepción por fraccionamiento. El cuarto es un precio correcto: cada operación tiene su costo de fondeo asociado y ninguna se otorga por debajo de la tasa mínima. Aquí la meta es que no haya ninguna operación por debajo de la tasa mínima.</w:t>
-      </w:r>
-    </w:p>
-    <w:p>
-      <w:pPr>
-        <w:spacing w:after="120"/>
-        <w:jc w:val="both"/>
-      </w:pPr>
-      <w:r>
-        <w:rPr>
-          <w:rFonts w:ascii="Calibri" w:cs="Calibri" w:eastAsia="Calibri" w:hAnsi="Calibri"/>
-          <w:sz w:val="21"/>
-          <w:szCs w:val="21"/>
-        </w:rPr>
-        <w:t xml:space="preserve">El quinto beneficio es una menor carga de trabajo en Riesgos, que pasa a ver solo las excepciones, incluidos los cheques forzados. Se medirá con la proporción de operaciones que revisa Riesgos sobre el total. El sexto es la agilidad en el descuento de cheques, gracias al scoring, la simulación y el desembolso automático después del primer acuerdo marco; se medirá con el tiempo que transcurre desde el endoso hasta el desembolso.</w:t>
-      </w:r>
-    </w:p>
-    <w:p>
-      <w:pPr>
-        <w:spacing w:after="120"/>
-        <w:jc w:val="both"/>
-      </w:pPr>
-      <w:r>
-        <w:rPr>
-          <w:rFonts w:ascii="Calibri" w:cs="Calibri" w:eastAsia="Calibri" w:hAnsi="Calibri"/>
-          <w:sz w:val="21"/>
-          <w:szCs w:val="21"/>
-        </w:rPr>
-        <w:t xml:space="preserve">Por último, el proyecto aporta trazabilidad y capacidad de auditoría, con el historial completo de minutas, versiones, aprobaciones, forzados y cambios de tasa. El indicador será la cantidad de consultas de auditoría que se resuelven directamente desde el sistema.</w:t>
+        <w:t xml:space="preserve">8. Reglas de negocio y responsabilidades</w:t>
+      </w:r>
+    </w:p>
+    <w:p>
+      <w:pPr>
+        <w:spacing w:after="120"/>
+        <w:jc w:val="both"/>
+      </w:pPr>
+      <w:r>
+        <w:rPr>
+          <w:rFonts w:ascii="Calibri" w:cs="Calibri" w:eastAsia="Calibri" w:hAnsi="Calibri"/>
+          <w:sz w:val="21"/>
+          <w:szCs w:val="21"/>
+        </w:rPr>
+        <w:t xml:space="preserve">El sistema debe asegurar un conjunto de reglas de negocio. Cada una reemplaza un control que hoy es manual o que directamente no existe.</w:t>
+      </w:r>
+    </w:p>
+    <w:p>
+      <w:pPr>
+        <w:pStyle w:val="Heading2"/>
+      </w:pPr>
+      <w:r>
+        <w:rPr>
+          <w:rFonts w:ascii="Calibri" w:cs="Calibri" w:eastAsia="Calibri" w:hAnsi="Calibri"/>
+        </w:rPr>
+        <w:t xml:space="preserve">Reglas sobre la minuta y la línea</w:t>
+      </w:r>
+    </w:p>
+    <w:p>
+      <w:pPr>
+        <w:spacing w:after="120"/>
+        <w:jc w:val="both"/>
+      </w:pPr>
+      <w:r>
+        <w:rPr>
+          <w:rFonts w:ascii="Calibri" w:cs="Calibri" w:eastAsia="Calibri" w:hAnsi="Calibri"/>
+          <w:sz w:val="21"/>
+          <w:szCs w:val="21"/>
+        </w:rPr>
+        <w:t xml:space="preserve">La minuta no se puede aprobar sin oficial y CUIT. Su aprobación dispara las acciones automáticas, y si alguna falla, queda pendiente y visible para que se resuelva. El aprobador comercial se determina según el oficial de la minuta. La instancia de aprobación depende de la línea: van al subcomité las líneas de hasta USD 1.000.000, las corporativas de hasta $1.000 millones y las de ALyC; el resto va al comité.</w:t>
+      </w:r>
+    </w:p>
+    <w:p>
+      <w:pPr>
+        <w:spacing w:after="120"/>
+        <w:jc w:val="both"/>
+      </w:pPr>
+      <w:r>
+        <w:rPr>
+          <w:rFonts w:ascii="Calibri" w:cs="Calibri" w:eastAsia="Calibri" w:hAnsi="Calibri"/>
+          <w:sz w:val="21"/>
+          <w:szCs w:val="21"/>
+        </w:rPr>
+        <w:t xml:space="preserve">En cuanto a las garantías de la línea, solo los subproductos que las requieren quedan pendientes hasta la conformidad de Activas, salvo que el gerente de Riesgos o el CEO fuercen el alta con regularización posterior. Los demás subproductos se impactan con la aprobación del comité. Una línea garantizada puede tener uno o más avales, cada uno con su vencimiento y con un avalista que debe estar en COBIS MIS; los documentos de los avales se adjuntan solo a modo informativo, y la conformidad de Activas deja la línea en vigencia y registra el aval en las garantías de COBIS. Las líneas en dólares solo se amplían por actualización del tipo de cambio a pedido de Middle Office y con la autorización del gerente de Riesgos.</w:t>
+      </w:r>
+    </w:p>
+    <w:p>
+      <w:pPr>
+        <w:pStyle w:val="Heading2"/>
+      </w:pPr>
+      <w:r>
+        <w:rPr>
+          <w:rFonts w:ascii="Calibri" w:cs="Calibri" w:eastAsia="Calibri" w:hAnsi="Calibri"/>
+        </w:rPr>
+        <w:t xml:space="preserve">Reglas sobre las operaciones</w:t>
+      </w:r>
+    </w:p>
+    <w:p>
+      <w:pPr>
+        <w:spacing w:after="120"/>
+        <w:jc w:val="both"/>
+      </w:pPr>
+      <w:r>
+        <w:rPr>
+          <w:rFonts w:ascii="Calibri" w:cs="Calibri" w:eastAsia="Calibri" w:hAnsi="Calibri"/>
+          <w:sz w:val="21"/>
+          <w:szCs w:val="21"/>
+        </w:rPr>
+        <w:t xml:space="preserve">Toda operación se inicia desde una línea vigente en la pantalla de líneas, salvo las renovaciones, que se inician desde la pantalla de vencimientos. En cada operación, la suma de las operaciones del grupo no puede superar la línea aprobada y ningún grupo puede superar el 15% de la RPC del banco, calculada según la normativa del BCRA sobre grandes exposiciones al riesgo de crédito (punto 2.1). Cada operación, al cargarse o renovarse, queda asociada al costo de fondeo del plazo máximo otorgado, y su tasa debe ser superior a la tasa mínima cargada por Mesa. Cuando una operación lleva garantía, su alta queda condicionada a la conformidad de Activas.</w:t>
+      </w:r>
+    </w:p>
+    <w:p>
+      <w:pPr>
+        <w:spacing w:after="120"/>
+        <w:jc w:val="both"/>
+      </w:pPr>
+      <w:r>
+        <w:rPr>
+          <w:rFonts w:ascii="Calibri" w:cs="Calibri" w:eastAsia="Calibri" w:hAnsi="Calibri"/>
+          <w:sz w:val="21"/>
+          <w:szCs w:val="21"/>
+        </w:rPr>
+        <w:t xml:space="preserve">Hay además reglas específicas por tipo de operación. En los préstamos, la operación se elige por su nombre y no por su código. En los descubiertos, se consumen primero los acuerdos con full numerales y después los demás, y no puede haber un descubierto nuevo si hay otro vigente del mismo tipo. En las renovaciones, se da de baja la operación anterior y se activa la nueva sin pasar por Riesgos; el usuario elige si la renovación es total o con cambio de importe, y si el importe es mayor, el sistema controla la línea al cargar y al adjudicar. En el descuento de cheques, se aceptan solo los cheques aprobados por el scoring o por Riesgos; sin tasa de descuento precargada no se puede simular; y Activas aprueba el acuerdo marco una sola vez, después de lo cual el desembolso es automático.</w:t>
+      </w:r>
+    </w:p>
+    <w:p>
+      <w:pPr>
+        <w:spacing w:after="120"/>
+        <w:jc w:val="both"/>
+      </w:pPr>
+      <w:r>
+        <w:rPr>
+          <w:rFonts w:ascii="Calibri" w:cs="Calibri" w:eastAsia="Calibri" w:hAnsi="Calibri"/>
+          <w:sz w:val="21"/>
+          <w:szCs w:val="21"/>
+        </w:rPr>
+        <w:t xml:space="preserve">La pantalla de vencimientos muestra por defecto las próximas dos semanas, con un plazo configurable, y solo permite descargar recibos de operaciones efectivamente cobradas. En la pantalla de líneas, las operaciones de cada línea se muestran ordenadas desde el primer vencimiento hasta el más futuro, con su tasa de operación, su tasa de fondeo, su vencimiento final y su plazo. En el tablero de oficiales, los cheques, rescates, transferencias y liquidaciones pendientes se muestran para decidir, pero no liberan fondos de forma automática. Las tablas de amortización solo pueden modificarse en préstamos liquidados y activos, sobre las cuotas no cobradas, con la adenda adjunta y con la aprobación de Activas. Por último, en todo el circuito, cada aprobación, cada forzado y cada cambio de tasa queda registrado con usuario y fecha.</w:t>
+      </w:r>
+    </w:p>
+    <w:p>
+      <w:pPr>
+        <w:pStyle w:val="Heading2"/>
+      </w:pPr>
+      <w:r>
+        <w:rPr>
+          <w:rFonts w:ascii="Calibri" w:cs="Calibri" w:eastAsia="Calibri" w:hAnsi="Calibri"/>
+        </w:rPr>
+        <w:t xml:space="preserve">Responsabilidades por área</w:t>
+      </w:r>
+    </w:p>
+    <w:p>
+      <w:pPr>
+        <w:spacing w:after="120"/>
+        <w:jc w:val="both"/>
+      </w:pPr>
+      <w:r>
+        <w:rPr>
+          <w:rFonts w:ascii="Calibri" w:cs="Calibri" w:eastAsia="Calibri" w:hAnsi="Calibri"/>
+          <w:sz w:val="21"/>
+          <w:szCs w:val="21"/>
+        </w:rPr>
+        <w:t xml:space="preserve">La propuesta de responsabilidades, que debe validarse con las áreas, es la siguiente.</w:t>
+      </w:r>
+    </w:p>
+    <w:p>
+      <w:pPr>
+        <w:spacing w:after="120"/>
+        <w:jc w:val="both"/>
+      </w:pPr>
+      <w:r>
+        <w:rPr>
+          <w:rFonts w:ascii="Calibri" w:cs="Calibri" w:eastAsia="Calibri" w:hAnsi="Calibri"/>
+          <w:sz w:val="21"/>
+          <w:szCs w:val="21"/>
+        </w:rPr>
+        <w:t xml:space="preserve">Riesgo de Crédito carga y edita el borrador de la minuta, con la participación del gerente de Riesgos. También revisa las excepciones de las operaciones y aprueba los cheques que se quieren forzar fuera del scoring. La aprobación de la minuta está a cargo del gerente de Riesgos, el CEO y el gerente comercial que corresponda según el oficial. El CEO firma por DocuSign las minutas del subcomité. El gerente de Riesgos y el CEO son los únicos que pueden forzar el alta de un subproducto con garantía pendiente. El gerente de Riesgos, además, autoriza las ampliaciones de las líneas en dólares por actualización del tipo de cambio.</w:t>
+      </w:r>
+    </w:p>
+    <w:p>
+      <w:pPr>
+        <w:spacing w:after="120"/>
+        <w:jc w:val="both"/>
+      </w:pPr>
+      <w:r>
+        <w:rPr>
+          <w:rFonts w:ascii="Calibri" w:cs="Calibri" w:eastAsia="Calibri" w:hAnsi="Calibri"/>
+          <w:sz w:val="21"/>
+          <w:szCs w:val="21"/>
+        </w:rPr>
+        <w:t xml:space="preserve">Middle Office es el área que opera. Detalla los avales de las líneas garantizadas y adjunta las fianzas generales; solicita las ampliaciones de las líneas en dólares; carga los préstamos, las prefinanciaciones y los descubiertos; renueva los descubiertos desde la pantalla de vencimientos; carga y simula los descuentos de cheques; y solicita las modificaciones de tablas de amortización.</w:t>
+      </w:r>
+    </w:p>
+    <w:p>
+      <w:pPr>
+        <w:spacing w:after="120"/>
+        <w:jc w:val="both"/>
+      </w:pPr>
+      <w:r>
+        <w:rPr>
+          <w:rFonts w:ascii="Calibri" w:cs="Calibri" w:eastAsia="Calibri" w:hAnsi="Calibri"/>
+          <w:sz w:val="21"/>
+          <w:szCs w:val="21"/>
+        </w:rPr>
+        <w:t xml:space="preserve">Activas otorga la conformidad de las garantías; autoriza los avales, con lo que deja la línea en vigencia y los registra en las garantías de COBIS; aprueba el acuerdo marco de cheques, con la parametrización de la cuenta de desembolso; y aprueba las modificaciones de tablas de amortización. Mesa carga y mantiene el costo de fondeo por plazo y las tasas mínimas.</w:t>
+      </w:r>
+    </w:p>
+    <w:p>
+      <w:pPr>
+        <w:spacing w:after="120"/>
+        <w:jc w:val="both"/>
+      </w:pPr>
+      <w:r>
+        <w:rPr>
+          <w:rFonts w:ascii="Calibri" w:cs="Calibri" w:eastAsia="Calibri" w:hAnsi="Calibri"/>
+          <w:sz w:val="21"/>
+          <w:szCs w:val="21"/>
+        </w:rPr>
+        <w:t xml:space="preserve">Todas las áreas involucradas pueden consultar las pantallas, el seguimiento y los reportes.</w:t>
+      </w:r>
+    </w:p>
+    <w:p>
+      <w:pPr>
+        <w:spacing w:after="120"/>
+        <w:jc w:val="both"/>
+      </w:pPr>
+      <w:r>
+        <w:rPr>
+          <w:rFonts w:ascii="Calibri" w:cs="Calibri" w:eastAsia="Calibri" w:hAnsi="Calibri"/>
+          <w:sz w:val="21"/>
+          <w:szCs w:val="21"/>
+        </w:rPr>
+        <w:t xml:space="preserve">Participan también otros actores. Red BI tiene a su cargo el desarrollo en COBIS Web. El equipo del desarrollo de modernización debe integrar el scoring de cheques. Y Sistemas y Operaciones, con Daniel Semino y Jonathan Domínguez, están a cargo del relevamiento, la coordinación y el seguimiento del proyecto.</w:t>
       </w:r>
     </w:p>
     <w:p>
@@ -2214,208 +2409,77 @@
         <w:rPr>
           <w:rFonts w:ascii="Calibri" w:cs="Calibri" w:eastAsia="Calibri" w:hAnsi="Calibri"/>
         </w:rPr>
-        <w:t xml:space="preserve">9. Plan de implementación y riesgos</w:t>
-      </w:r>
-    </w:p>
-    <w:p>
-      <w:pPr>
-        <w:pStyle w:val="Heading2"/>
-      </w:pPr>
-      <w:r>
-        <w:rPr>
-          <w:rFonts w:ascii="Calibri" w:cs="Calibri" w:eastAsia="Calibri" w:hAnsi="Calibri"/>
-        </w:rPr>
-        <w:t xml:space="preserve">Plan por fases</w:t>
-      </w:r>
-    </w:p>
-    <w:p>
-      <w:pPr>
-        <w:spacing w:after="120"/>
-        <w:jc w:val="both"/>
-      </w:pPr>
-      <w:r>
-        <w:rPr>
-          <w:rFonts w:ascii="Calibri" w:cs="Calibri" w:eastAsia="Calibri" w:hAnsi="Calibri"/>
-          <w:sz w:val="21"/>
-          <w:szCs w:val="21"/>
-        </w:rPr>
-        <w:t xml:space="preserve">El proyecto se propone en tres fases, que empiezan por la línea y el costeo porque, sin una línea cargada y sin un costo de fondeo, no se puede cargar ninguna operación.</w:t>
-      </w:r>
-    </w:p>
-    <w:p>
-      <w:pPr>
-        <w:spacing w:after="120"/>
-        <w:jc w:val="both"/>
-      </w:pPr>
-      <w:r>
-        <w:rPr>
-          <w:rFonts w:ascii="Calibri" w:cs="Calibri" w:eastAsia="Calibri" w:hAnsi="Calibri"/>
-          <w:sz w:val="21"/>
-          <w:szCs w:val="21"/>
-        </w:rPr>
-        <w:t xml:space="preserve">La primera fase, de minutas, líneas y costeo, incluye los módulos A, B, C y E. Entrega la pantalla de minutas con la aprobación y sus acciones automáticas, el alta de líneas con la gestión de garantías por subproducto y el forzado, el circuito de avales con su registro en las garantías de COBIS, y el costeo con el costo de fondeo y las tasas mínimas. Es la base sobre la que se apoya todo lo demás.</w:t>
-      </w:r>
-    </w:p>
-    <w:p>
-      <w:pPr>
-        <w:spacing w:after="120"/>
-        <w:jc w:val="both"/>
-      </w:pPr>
-      <w:r>
-        <w:rPr>
-          <w:rFonts w:ascii="Calibri" w:cs="Calibri" w:eastAsia="Calibri" w:hAnsi="Calibri"/>
-          <w:sz w:val="21"/>
-          <w:szCs w:val="21"/>
-        </w:rPr>
-        <w:t xml:space="preserve">La segunda fase, de operaciones, incluye los módulos D, F, I y J. Entrega la pantalla de líneas como punto de entrada, con la solicitud de ampliación de las líneas en dólares, la carga guiada de descubiertos, la pantalla de vencimientos con la renovación, y el seguimiento y los reportes. Se prioriza porque concentra el mayor volumen operativo y elimina el control manual del fraccionamiento.</w:t>
-      </w:r>
-    </w:p>
-    <w:p>
-      <w:pPr>
-        <w:spacing w:after="120"/>
-        <w:jc w:val="both"/>
-      </w:pPr>
-      <w:r>
-        <w:rPr>
-          <w:rFonts w:ascii="Calibri" w:cs="Calibri" w:eastAsia="Calibri" w:hAnsi="Calibri"/>
-          <w:sz w:val="21"/>
-          <w:szCs w:val="21"/>
-        </w:rPr>
-        <w:t xml:space="preserve">La tercera fase, de complementos, incluye los módulos G, H, K y L. Entrega la carga de préstamos con tablas de amortización, el descuento de cheques con scoring, la modificación de tablas de amortización de préstamos activos y la consulta de cheques por cliente contra COELSA. Se deja para el final porque estos módulos requieren un relevamiento adicional o definiciones de terceros, como el desarrollo de modernización.</w:t>
-      </w:r>
-    </w:p>
-    <w:p>
-      <w:pPr>
-        <w:spacing w:after="120"/>
-        <w:jc w:val="both"/>
-      </w:pPr>
-      <w:r>
-        <w:rPr>
-          <w:rFonts w:ascii="Calibri" w:cs="Calibri" w:eastAsia="Calibri" w:hAnsi="Calibri"/>
-          <w:sz w:val="21"/>
-          <w:szCs w:val="21"/>
-        </w:rPr>
-        <w:t xml:space="preserve">Esta división en fases es una propuesta para discusión y no surgió del relevamiento. Las fechas y los esfuerzos se estimarán con Red BI.</w:t>
-      </w:r>
-    </w:p>
-    <w:p>
-      <w:pPr>
-        <w:pStyle w:val="Heading2"/>
-      </w:pPr>
-      <w:r>
-        <w:rPr>
-          <w:rFonts w:ascii="Calibri" w:cs="Calibri" w:eastAsia="Calibri" w:hAnsi="Calibri"/>
-        </w:rPr>
-        <w:t xml:space="preserve">Dependencias y riesgos</w:t>
-      </w:r>
-    </w:p>
-    <w:p>
-      <w:pPr>
-        <w:spacing w:after="120"/>
-        <w:jc w:val="both"/>
-      </w:pPr>
-      <w:r>
-        <w:rPr>
-          <w:rFonts w:ascii="Calibri" w:cs="Calibri" w:eastAsia="Calibri" w:hAnsi="Calibri"/>
-          <w:sz w:val="21"/>
-          <w:szCs w:val="21"/>
-        </w:rPr>
-        <w:t xml:space="preserve">El proyecto tiene seis dependencias o riesgos principales, cada uno con su mitigación.</w:t>
-      </w:r>
-    </w:p>
-    <w:p>
-      <w:pPr>
-        <w:spacing w:after="120"/>
-        <w:jc w:val="both"/>
-      </w:pPr>
-      <w:r>
-        <w:rPr>
-          <w:rFonts w:ascii="Calibri" w:cs="Calibri" w:eastAsia="Calibri" w:hAnsi="Calibri"/>
-          <w:sz w:val="21"/>
-          <w:szCs w:val="21"/>
-        </w:rPr>
-        <w:t xml:space="preserve">El primero es la capacidad y los plazos de Red BI, que pueden demorar todo el proyecto. Para mitigarlo, se propone priorizar por fases y acordar un cronograma por módulo. El segundo es el registro automático de los avales en las garantías de COBIS, que es la base del módulo C; hay que confirmar con Red BI cómo se integra con COBIS antes de estimarlo.</w:t>
-      </w:r>
-    </w:p>
-    <w:p>
-      <w:pPr>
-        <w:spacing w:after="120"/>
-        <w:jc w:val="both"/>
-      </w:pPr>
-      <w:r>
-        <w:rPr>
-          <w:rFonts w:ascii="Calibri" w:cs="Calibri" w:eastAsia="Calibri" w:hAnsi="Calibri"/>
-          <w:sz w:val="21"/>
-          <w:szCs w:val="21"/>
-        </w:rPr>
-        <w:t xml:space="preserve">El tercero es la calidad de los grupos económicos en COBIS MIS. Si los grupos no están bien definidos, los controles de fraccionamiento serán incorrectos, por lo que hay que depurarlos antes de activar el control. El cuarto es la integración con el scoring del desarrollo de modernización, que bloquea la selección automática de cheques; esa integración debe definirse con el equipo correspondiente antes de estimar el módulo H.</w:t>
-      </w:r>
-    </w:p>
-    <w:p>
-      <w:pPr>
-        <w:spacing w:after="120"/>
-        <w:jc w:val="both"/>
-      </w:pPr>
-      <w:r>
-        <w:rPr>
-          <w:rFonts w:ascii="Calibri" w:cs="Calibri" w:eastAsia="Calibri" w:hAnsi="Calibri"/>
-          <w:sz w:val="21"/>
-          <w:szCs w:val="21"/>
-        </w:rPr>
-        <w:t xml:space="preserve">El quinto es el tiempo de respuesta de Activas, que puede dejar subproductos pendientes de garantía. Se mitiga con el forzado con regularización y con alertas de pendientes. El sexto es el cambio de hábito en los comités: existe el riesgo de que la minuta se siga armando por fuera. Para evitarlo, se propone establecer que solo tenga validez la minuta aprobada en el sistema.</w:t>
-      </w:r>
-    </w:p>
-    <w:p>
-      <w:pPr>
-        <w:pStyle w:val="Heading2"/>
-      </w:pPr>
-      <w:r>
-        <w:rPr>
-          <w:rFonts w:ascii="Calibri" w:cs="Calibri" w:eastAsia="Calibri" w:hAnsi="Calibri"/>
-        </w:rPr>
-        <w:t xml:space="preserve">Puntos abiertos</w:t>
-      </w:r>
-    </w:p>
-    <w:p>
-      <w:pPr>
-        <w:spacing w:after="120"/>
-        <w:jc w:val="both"/>
-      </w:pPr>
-      <w:r>
-        <w:rPr>
-          <w:rFonts w:ascii="Calibri" w:cs="Calibri" w:eastAsia="Calibri" w:hAnsi="Calibri"/>
-          <w:sz w:val="21"/>
-          <w:szCs w:val="21"/>
-        </w:rPr>
-        <w:t xml:space="preserve">Quedan varios puntos por definir antes de desarrollar. Hay que establecer quién registra en el sistema la aprobación durante el comité, dado que el borrador lo carga Riesgos, y cerrar la lista definitiva de acciones automáticas de la aprobación, incluido qué ocurre si alguna falla. Hay que relevar el circuito de carga de préstamos y de prefinanciaciones de exportaciones e importaciones desde la pantalla de líneas.</w:t>
-      </w:r>
-    </w:p>
-    <w:p>
-      <w:pPr>
-        <w:spacing w:after="120"/>
-        <w:jc w:val="both"/>
-      </w:pPr>
-      <w:r>
-        <w:rPr>
-          <w:rFonts w:ascii="Calibri" w:cs="Calibri" w:eastAsia="Calibri" w:hAnsi="Calibri"/>
-          <w:sz w:val="21"/>
-          <w:szCs w:val="21"/>
-        </w:rPr>
-        <w:t xml:space="preserve">En el costeo, hay que definir los tramos de plazo del costo de fondeo y si varían por moneda, y quién carga y mantiene la tasa de descuento precargada de los cheques, que podría ser Mesa desde el módulo E. En los avales, hay que definir cómo se gestiona su vencimiento. En los descubiertos, hay que confirmar el rango definitivo de acuerdos con y sin full numerales, ya que la división entre C1 a C5 y C6 a C9 es solo un ejemplo.</w:t>
-      </w:r>
-    </w:p>
-    <w:p>
-      <w:pPr>
-        <w:spacing w:after="120"/>
-        <w:jc w:val="both"/>
-      </w:pPr>
-      <w:r>
-        <w:rPr>
-          <w:rFonts w:ascii="Calibri" w:cs="Calibri" w:eastAsia="Calibri" w:hAnsi="Calibri"/>
-          <w:sz w:val="21"/>
-          <w:szCs w:val="21"/>
-        </w:rPr>
-        <w:t xml:space="preserve">También deben definirse los criterios y la auditoría del forzado de alta por parte del gerente de Riesgos o el CEO; y el alcance de la definición de que "todo lo que está en Trámites y Gestión pase por COBIS Web", para confirmar si incluye otros productos. Por último, este informe debe contrastarse con las transcripciones de las reuniones del 7 y del 16 de octubre, que hay que descargar desde Teams, en particular para completar el módulo L.</w:t>
+        <w:t xml:space="preserve">9. Beneficios esperados</w:t>
+      </w:r>
+    </w:p>
+    <w:p>
+      <w:pPr>
+        <w:spacing w:after="120"/>
+        <w:jc w:val="both"/>
+      </w:pPr>
+      <w:r>
+        <w:rPr>
+          <w:rFonts w:ascii="Calibri" w:cs="Calibri" w:eastAsia="Calibri" w:hAnsi="Calibri"/>
+          <w:sz w:val="21"/>
+          <w:szCs w:val="21"/>
+        </w:rPr>
+        <w:t xml:space="preserve">El proyecto genera beneficios concretos y medibles, y para cada uno se propone un indicador que permita seguir su evolución.</w:t>
+      </w:r>
+    </w:p>
+    <w:p>
+      <w:pPr>
+        <w:spacing w:after="120"/>
+        <w:jc w:val="both"/>
+      </w:pPr>
+      <w:r>
+        <w:rPr>
+          <w:rFonts w:ascii="Calibri" w:cs="Calibri" w:eastAsia="Calibri" w:hAnsi="Calibri"/>
+          <w:sz w:val="21"/>
+          <w:szCs w:val="21"/>
+        </w:rPr>
+        <w:t xml:space="preserve">El primer beneficio es la reducción del tiempo de alta de las líneas, que pasa de cinco pasos manuales a una sola aprobación con acciones automáticas. Se medirá con las horas que transcurren entre la aprobación del comité y la línea activa. El segundo es la reducción de los errores de carga, porque la línea sale de la misma minuta aprobada; el indicador será la cantidad de correcciones de líneas por mes.</w:t>
+      </w:r>
+    </w:p>
+    <w:p>
+      <w:pPr>
+        <w:spacing w:after="120"/>
+        <w:jc w:val="both"/>
+      </w:pPr>
+      <w:r>
+        <w:rPr>
+          <w:rFonts w:ascii="Calibri" w:cs="Calibri" w:eastAsia="Calibri" w:hAnsi="Calibri"/>
+          <w:sz w:val="21"/>
+          <w:szCs w:val="21"/>
+        </w:rPr>
+        <w:t xml:space="preserve">El tercer beneficio es el cumplimiento regulatorio, porque el límite del 15% de la RPC se controla en cada operación. Se medirá con la cantidad de operaciones bloqueadas o enviadas como excepción por fraccionamiento. El cuarto es un precio correcto: cada operación tiene su costo de fondeo asociado y ninguna se otorga por debajo de la tasa mínima. Aquí la meta es que no haya ninguna operación por debajo de la tasa mínima.</w:t>
+      </w:r>
+    </w:p>
+    <w:p>
+      <w:pPr>
+        <w:spacing w:after="120"/>
+        <w:jc w:val="both"/>
+      </w:pPr>
+      <w:r>
+        <w:rPr>
+          <w:rFonts w:ascii="Calibri" w:cs="Calibri" w:eastAsia="Calibri" w:hAnsi="Calibri"/>
+          <w:sz w:val="21"/>
+          <w:szCs w:val="21"/>
+        </w:rPr>
+        <w:t xml:space="preserve">El quinto beneficio es una menor carga de trabajo en Riesgos, que pasa a ver solo las excepciones, incluidos los cheques forzados. Se medirá con la proporción de operaciones que revisa Riesgos sobre el total. El sexto es la agilidad en el descuento de cheques, gracias al scoring, la simulación y el desembolso automático después del primer acuerdo marco; se medirá con el tiempo que transcurre desde el endoso hasta el desembolso.</w:t>
+      </w:r>
+    </w:p>
+    <w:p>
+      <w:pPr>
+        <w:spacing w:after="120"/>
+        <w:jc w:val="both"/>
+      </w:pPr>
+      <w:r>
+        <w:rPr>
+          <w:rFonts w:ascii="Calibri" w:cs="Calibri" w:eastAsia="Calibri" w:hAnsi="Calibri"/>
+          <w:sz w:val="21"/>
+          <w:szCs w:val="21"/>
+        </w:rPr>
+        <w:t xml:space="preserve">Por último, el proyecto aporta trazabilidad y capacidad de auditoría, con el historial completo de minutas, versiones, aprobaciones, forzados y cambios de tasa. El indicador será la cantidad de consultas de auditoría que se resuelven directamente desde el sistema.</w:t>
       </w:r>
     </w:p>
     <w:p>
@@ -2427,21 +2491,248 @@
         <w:rPr>
           <w:rFonts w:ascii="Calibri" w:cs="Calibri" w:eastAsia="Calibri" w:hAnsi="Calibri"/>
         </w:rPr>
-        <w:t xml:space="preserve">10. Próximos pasos</w:t>
-      </w:r>
-    </w:p>
-    <w:p>
-      <w:pPr>
-        <w:spacing w:after="120"/>
-        <w:jc w:val="both"/>
-      </w:pPr>
-      <w:r>
-        <w:rPr>
-          <w:rFonts w:ascii="Calibri" w:cs="Calibri" w:eastAsia="Calibri" w:hAnsi="Calibri"/>
-          <w:sz w:val="21"/>
-          <w:szCs w:val="21"/>
-        </w:rPr>
-        <w:t xml:space="preserve">Para avanzar con el proyecto se proponen siete pasos. El primero es validar este informe con Middle Office y Riesgos, incluyendo la transcripción de la reunión del 7 de octubre, a cargo de Daniel Semino y Jonathan Domínguez. El segundo es definir con Riesgos el diseño de la pantalla de minutas y la lista de acciones automáticas, junto con Sistemas. El tercero es cerrar los puntos abiertos, con la participación de Middle Office, Riesgos, Mesa y Activas.</w:t>
+        <w:t xml:space="preserve">10. Plan de implementación y riesgos</w:t>
+      </w:r>
+    </w:p>
+    <w:p>
+      <w:pPr>
+        <w:pStyle w:val="Heading2"/>
+      </w:pPr>
+      <w:r>
+        <w:rPr>
+          <w:rFonts w:ascii="Calibri" w:cs="Calibri" w:eastAsia="Calibri" w:hAnsi="Calibri"/>
+        </w:rPr>
+        <w:t xml:space="preserve">Plan por fases</w:t>
+      </w:r>
+    </w:p>
+    <w:p>
+      <w:pPr>
+        <w:spacing w:after="120"/>
+        <w:jc w:val="both"/>
+      </w:pPr>
+      <w:r>
+        <w:rPr>
+          <w:rFonts w:ascii="Calibri" w:cs="Calibri" w:eastAsia="Calibri" w:hAnsi="Calibri"/>
+          <w:sz w:val="21"/>
+          <w:szCs w:val="21"/>
+        </w:rPr>
+        <w:t xml:space="preserve">El proyecto se propone en tres fases, que empiezan por la línea y el costeo porque, sin una línea cargada y sin un costo de fondeo, no se puede cargar ninguna operación.</w:t>
+      </w:r>
+    </w:p>
+    <w:p>
+      <w:pPr>
+        <w:spacing w:after="120"/>
+        <w:jc w:val="both"/>
+      </w:pPr>
+      <w:r>
+        <w:rPr>
+          <w:rFonts w:ascii="Calibri" w:cs="Calibri" w:eastAsia="Calibri" w:hAnsi="Calibri"/>
+          <w:sz w:val="21"/>
+          <w:szCs w:val="21"/>
+        </w:rPr>
+        <w:t xml:space="preserve">La primera fase, de minutas, líneas y costeo, incluye los módulos A, B, C y E. Entrega la pantalla de minutas con la aprobación y sus acciones automáticas, el alta de líneas con la gestión de garantías por subproducto y el forzado, el circuito de avales con su registro en las garantías de COBIS, y el costeo con el costo de fondeo y las tasas mínimas. Es la base sobre la que se apoya todo lo demás.</w:t>
+      </w:r>
+    </w:p>
+    <w:p>
+      <w:pPr>
+        <w:spacing w:after="120"/>
+        <w:jc w:val="both"/>
+      </w:pPr>
+      <w:r>
+        <w:rPr>
+          <w:rFonts w:ascii="Calibri" w:cs="Calibri" w:eastAsia="Calibri" w:hAnsi="Calibri"/>
+          <w:sz w:val="21"/>
+          <w:szCs w:val="21"/>
+        </w:rPr>
+        <w:t xml:space="preserve">La segunda fase, de operaciones, incluye los módulos D, F, I y J. Entrega la pantalla de líneas como punto de entrada, con la solicitud de ampliación de las líneas en dólares, la carga guiada de descubiertos, la pantalla de vencimientos con la renovación, y el seguimiento y los reportes. Se prioriza porque concentra el mayor volumen operativo y elimina el control manual del fraccionamiento.</w:t>
+      </w:r>
+    </w:p>
+    <w:p>
+      <w:pPr>
+        <w:spacing w:after="120"/>
+        <w:jc w:val="both"/>
+      </w:pPr>
+      <w:r>
+        <w:rPr>
+          <w:rFonts w:ascii="Calibri" w:cs="Calibri" w:eastAsia="Calibri" w:hAnsi="Calibri"/>
+          <w:sz w:val="21"/>
+          <w:szCs w:val="21"/>
+        </w:rPr>
+        <w:t xml:space="preserve">La tercera fase, de complementos, incluye los módulos G, H y K. Entrega la carga de préstamos con tablas de amortización, el descuento de cheques con scoring, y la modificación de tablas de amortización de préstamos activos. Se deja para el final porque estos módulos requieren un relevamiento adicional o definiciones de terceros, como el desarrollo de modernización.</w:t>
+      </w:r>
+    </w:p>
+    <w:p>
+      <w:pPr>
+        <w:spacing w:after="120"/>
+        <w:jc w:val="both"/>
+      </w:pPr>
+      <w:r>
+        <w:rPr>
+          <w:rFonts w:ascii="Calibri" w:cs="Calibri" w:eastAsia="Calibri" w:hAnsi="Calibri"/>
+          <w:sz w:val="21"/>
+          <w:szCs w:val="21"/>
+        </w:rPr>
+        <w:t xml:space="preserve">Una cuarta fase corresponde al tablero de oficiales, con los módulos L a P. Depende del relevamiento técnico de los datos y del wireframe de validación que preparará Red Bee.</w:t>
+      </w:r>
+    </w:p>
+    <w:p>
+      <w:pPr>
+        <w:spacing w:after="120"/>
+        <w:jc w:val="both"/>
+      </w:pPr>
+      <w:r>
+        <w:rPr>
+          <w:rFonts w:ascii="Calibri" w:cs="Calibri" w:eastAsia="Calibri" w:hAnsi="Calibri"/>
+          <w:sz w:val="21"/>
+          <w:szCs w:val="21"/>
+        </w:rPr>
+        <w:t xml:space="preserve">Esta división en fases es una propuesta para discusión y no surgió del relevamiento. Las fechas y los esfuerzos se estimarán con Red BI.</w:t>
+      </w:r>
+    </w:p>
+    <w:p>
+      <w:pPr>
+        <w:pStyle w:val="Heading2"/>
+      </w:pPr>
+      <w:r>
+        <w:rPr>
+          <w:rFonts w:ascii="Calibri" w:cs="Calibri" w:eastAsia="Calibri" w:hAnsi="Calibri"/>
+        </w:rPr>
+        <w:t xml:space="preserve">Dependencias y riesgos</w:t>
+      </w:r>
+    </w:p>
+    <w:p>
+      <w:pPr>
+        <w:spacing w:after="120"/>
+        <w:jc w:val="both"/>
+      </w:pPr>
+      <w:r>
+        <w:rPr>
+          <w:rFonts w:ascii="Calibri" w:cs="Calibri" w:eastAsia="Calibri" w:hAnsi="Calibri"/>
+          <w:sz w:val="21"/>
+          <w:szCs w:val="21"/>
+        </w:rPr>
+        <w:t xml:space="preserve">El proyecto tiene siete dependencias o riesgos principales, cada uno con su mitigación.</w:t>
+      </w:r>
+    </w:p>
+    <w:p>
+      <w:pPr>
+        <w:spacing w:after="120"/>
+        <w:jc w:val="both"/>
+      </w:pPr>
+      <w:r>
+        <w:rPr>
+          <w:rFonts w:ascii="Calibri" w:cs="Calibri" w:eastAsia="Calibri" w:hAnsi="Calibri"/>
+          <w:sz w:val="21"/>
+          <w:szCs w:val="21"/>
+        </w:rPr>
+        <w:t xml:space="preserve">El primero es la capacidad y los plazos de Red BI, que pueden demorar todo el proyecto. Para mitigarlo, se propone priorizar por fases y acordar un cronograma por módulo. El segundo es el registro automático de los avales en las garantías de COBIS, que es la base del módulo C; hay que confirmar con Red BI cómo se integra con COBIS antes de estimarlo.</w:t>
+      </w:r>
+    </w:p>
+    <w:p>
+      <w:pPr>
+        <w:spacing w:after="120"/>
+        <w:jc w:val="both"/>
+      </w:pPr>
+      <w:r>
+        <w:rPr>
+          <w:rFonts w:ascii="Calibri" w:cs="Calibri" w:eastAsia="Calibri" w:hAnsi="Calibri"/>
+          <w:sz w:val="21"/>
+          <w:szCs w:val="21"/>
+        </w:rPr>
+        <w:t xml:space="preserve">El tercero es la calidad de los grupos económicos en COBIS MIS. Si los grupos no están bien definidos, los controles de fraccionamiento serán incorrectos, por lo que hay que depurarlos antes de activar el control. El cuarto es la integración con el scoring del desarrollo de modernización, que bloquea la selección automática de cheques; esa integración debe definirse con el equipo correspondiente antes de estimar el módulo H.</w:t>
+      </w:r>
+    </w:p>
+    <w:p>
+      <w:pPr>
+        <w:spacing w:after="120"/>
+        <w:jc w:val="both"/>
+      </w:pPr>
+      <w:r>
+        <w:rPr>
+          <w:rFonts w:ascii="Calibri" w:cs="Calibri" w:eastAsia="Calibri" w:hAnsi="Calibri"/>
+          <w:sz w:val="21"/>
+          <w:szCs w:val="21"/>
+        </w:rPr>
+        <w:t xml:space="preserve">El quinto es el tiempo de respuesta de Activas, que puede dejar subproductos pendientes de garantía. Se mitiga con el forzado con regularización y con alertas de pendientes. El sexto es el cambio de hábito en los comités: existe el riesgo de que la minuta se siga armando por fuera. Para evitarlo, se propone establecer que solo tenga validez la minuta aprobada en el sistema. El séptimo es que los datos del tablero de oficiales están en sistemas distintos y muchos se actualizan con un día de demora; el relevamiento técnico con COBIS y Sistemas debe confirmar qué información puede mostrarse actualizada antes de comprometer el alcance del tablero.</w:t>
+      </w:r>
+    </w:p>
+    <w:p>
+      <w:pPr>
+        <w:pStyle w:val="Heading2"/>
+      </w:pPr>
+      <w:r>
+        <w:rPr>
+          <w:rFonts w:ascii="Calibri" w:cs="Calibri" w:eastAsia="Calibri" w:hAnsi="Calibri"/>
+        </w:rPr>
+        <w:t xml:space="preserve">Puntos abiertos</w:t>
+      </w:r>
+    </w:p>
+    <w:p>
+      <w:pPr>
+        <w:spacing w:after="120"/>
+        <w:jc w:val="both"/>
+      </w:pPr>
+      <w:r>
+        <w:rPr>
+          <w:rFonts w:ascii="Calibri" w:cs="Calibri" w:eastAsia="Calibri" w:hAnsi="Calibri"/>
+          <w:sz w:val="21"/>
+          <w:szCs w:val="21"/>
+        </w:rPr>
+        <w:t xml:space="preserve">Quedan varios puntos por definir antes de desarrollar. Hay que establecer quién registra en el sistema la aprobación durante el comité, dado que el borrador lo carga Riesgos, y cerrar la lista definitiva de acciones automáticas de la aprobación, incluido qué ocurre si alguna falla. Hay que relevar el circuito de carga de préstamos y de prefinanciaciones de exportaciones e importaciones desde la pantalla de líneas.</w:t>
+      </w:r>
+    </w:p>
+    <w:p>
+      <w:pPr>
+        <w:spacing w:after="120"/>
+        <w:jc w:val="both"/>
+      </w:pPr>
+      <w:r>
+        <w:rPr>
+          <w:rFonts w:ascii="Calibri" w:cs="Calibri" w:eastAsia="Calibri" w:hAnsi="Calibri"/>
+          <w:sz w:val="21"/>
+          <w:szCs w:val="21"/>
+        </w:rPr>
+        <w:t xml:space="preserve">En el costeo, hay que definir los tramos de plazo del costo de fondeo y si varían por moneda, y quién carga y mantiene la tasa de descuento precargada de los cheques, que podría ser Mesa desde el módulo E. En los avales, hay que definir cómo se gestiona su vencimiento. En los descubiertos, hay que confirmar el rango definitivo de acuerdos con y sin full numerales, ya que la división entre C1 a C5 y C6 a C9 es solo un ejemplo.</w:t>
+      </w:r>
+    </w:p>
+    <w:p>
+      <w:pPr>
+        <w:spacing w:after="120"/>
+        <w:jc w:val="both"/>
+      </w:pPr>
+      <w:r>
+        <w:rPr>
+          <w:rFonts w:ascii="Calibri" w:cs="Calibri" w:eastAsia="Calibri" w:hAnsi="Calibri"/>
+          <w:sz w:val="21"/>
+          <w:szCs w:val="21"/>
+        </w:rPr>
+        <w:t xml:space="preserve">También deben definirse los criterios y la auditoría del forzado de alta por parte del gerente de Riesgos o el CEO; y el alcance de la definición de que "todo lo que está en Trámites y Gestión pase por COBIS Web", para confirmar si incluye otros productos. Queda por revisar si un cliente con límite disponible aprobado puede operar hasta ese límite sin pedir un acuerdo adicional por cada pago, considerando las restricciones de riesgo, previsiones, capital y normativa, y cómo se definen los permisos de los oficiales sobre carteras ajenas.</w:t>
+      </w:r>
+    </w:p>
+    <w:p>
+      <w:pPr>
+        <w:pStyle w:val="Heading1"/>
+        <w:pageBreakBefore/>
+      </w:pPr>
+      <w:r>
+        <w:rPr>
+          <w:rFonts w:ascii="Calibri" w:cs="Calibri" w:eastAsia="Calibri" w:hAnsi="Calibri"/>
+        </w:rPr>
+        <w:t xml:space="preserve">11. Próximos pasos</w:t>
+      </w:r>
+    </w:p>
+    <w:p>
+      <w:pPr>
+        <w:spacing w:after="120"/>
+        <w:jc w:val="both"/>
+      </w:pPr>
+      <w:r>
+        <w:rPr>
+          <w:rFonts w:ascii="Calibri" w:cs="Calibri" w:eastAsia="Calibri" w:hAnsi="Calibri"/>
+          <w:sz w:val="21"/>
+          <w:szCs w:val="21"/>
+        </w:rPr>
+        <w:t xml:space="preserve">Para avanzar con el proyecto se proponen los siguientes pasos. El primero es validar este informe con Middle Office y Riesgos, a cargo de Daniel Semino y Jonathan Domínguez. El segundo es definir con Riesgos el diseño de la pantalla de minutas y la lista de acciones automáticas, junto con Sistemas. El tercero es cerrar los puntos abiertos, con la participación de Middle Office, Riesgos, Mesa y Activas.</w:t>
       </w:r>
     </w:p>
     <w:p>
@@ -2456,6 +2747,20 @@
           <w:szCs w:val="21"/>
         </w:rPr>
         <w:t xml:space="preserve">Los pasos siguientes están a cargo de Sistemas: definir con el equipo de modernización la integración del scoring de cheques, presentar el alcance a Red BI para pedir una estimación por módulo, y confirmar con Red BI la integración del registro de avales en las garantías de COBIS. El último paso es acordar la priorización por fases y el cronograma entre la Gerencia de Operaciones, Comercial y Riesgos.</w:t>
+      </w:r>
+    </w:p>
+    <w:p>
+      <w:pPr>
+        <w:spacing w:after="120"/>
+        <w:jc w:val="both"/>
+      </w:pPr>
+      <w:r>
+        <w:rPr>
+          <w:rFonts w:ascii="Calibri" w:cs="Calibri" w:eastAsia="Calibri" w:hAnsi="Calibri"/>
+          <w:sz w:val="21"/>
+          <w:szCs w:val="21"/>
+        </w:rPr>
+        <w:t xml:space="preserve">Para el tablero de oficiales, los pasos acordados en el Discovery son: Barbi Aceto consolida los requerimientos y prepara un wireframe de baja fidelidad para validarlo con los usuarios; Barbi Aceto, Adrián Porto y José Luis Cárdenas coordinan el relevamiento técnico de los datos con Julio, Pepe y el equipo de COBIS; Eugenio Ayerza, Ariel Scodellaro y Valeria Grollino envían capturas de COBIS y ejemplos de los reportes actuales; Adrián Porto y Daniel Semino revisan con Cristian la viabilidad de los acuerdos con fecha valor y, con la Mesa, dónde registrar el histórico de tasas de transferencia; y Barbi Aceto y Adrián Porto definen cómo mostrar el plazo de cada sublímite y la alerta de 60 días.</w:t>
       </w:r>
     </w:p>
     <w:p>

</xml_diff>

<commit_message>
Consultar operaciones desde el consumido del subproducto, vinculado al Módulo M
Co-Authored-By: Claude Opus 5.5 <noreply@anthropic.com>
Claude-Session: https://claude.ai/code/session_01JR48ZtjHAJWp3RfTGUyHxs
</commit_message>
<xml_diff>
--- a/Informe_Nueva_Aplicacion_Gestion_Middle_Office.docx
+++ b/Informe_Nueva_Aplicacion_Gestion_Middle_Office.docx
@@ -1351,7 +1351,7 @@
           <w:sz w:val="21"/>
           <w:szCs w:val="21"/>
         </w:rPr>
-        <w:t xml:space="preserve">Desde el monto disponible de cada línea, el usuario puede ver todas las operaciones que la consumen. La lista se ordena por vencimiento, desde la operación con el primer vencimiento hasta la más futura, de modo que se lea en el orden en que la línea se va liberando. De cada operación se muestran el tipo y el monto, la tasa de la operación, la tasa de fondeo asociada según su plazo máximo, la fecha de vencimiento final y el plazo de la operación. Así, en una sola vista se ve qué consume la línea, a qué tasa, con qué costo y hasta cuándo.</w:t>
+        <w:t xml:space="preserve">Desde el resumen de disponibilidad de la línea, el usuario puede consultar las operaciones a partir del consumido. Al seleccionar un subproducto y hacer clic en su consumido, la consulta se vincula con la visión consolidada del cliente (módulo M), filtrada por ese subproducto, y desde ahí el usuario se dirige a las operaciones que el cliente tiene concertadas. Las operaciones se ordenan desde la que vence primero hasta la última, de modo que se lean en el orden en que el subproducto se va liberando. De cada operación se muestran el tipo y el monto, la tasa de la operación, la tasa de fondeo asociada según su plazo máximo, la fecha de vencimiento final y el plazo de la operación. Así, en una sola vista se ve qué consume la línea, a qué tasa, con qué costo y hasta cuándo.</w:t>
       </w:r>
     </w:p>
     <w:p>
@@ -1986,7 +1986,7 @@
           <w:sz w:val="21"/>
           <w:szCs w:val="21"/>
         </w:rPr>
-        <w:t xml:space="preserve">El objetivo de este módulo es reunir toda la información del cliente en un solo lugar y con datos del día. La pantalla muestra las líneas aprobadas y sus sublímites, con el plazo permitido de cada uno; las operaciones vigentes, con su tipo, tasa, monto y vencimiento; las cuentas abiertas y sus firmantes; los saldos históricos e intradía y los movimientos del día; y el estado de las cuentas, incluidos los embargos y bloqueos.</w:t>
+        <w:t xml:space="preserve">El objetivo de este módulo es reunir toda la información del cliente en un solo lugar y con datos del día. La pantalla muestra las líneas aprobadas y sus sublímites, con el plazo permitido de cada uno; las operaciones vigentes, con su tipo, tasa, monto y vencimiento, que pueden filtrarse por subproducto y se ordenan desde la que vence primero hasta la última (a esta vista se llega también desde el consumido de cada subproducto en la pantalla de líneas); las cuentas abiertas y sus firmantes; los saldos históricos e intradía y los movimientos del día; y el estado de las cuentas, incluidos los embargos y bloqueos.</w:t>
       </w:r>
     </w:p>
     <w:p>
@@ -2302,7 +2302,7 @@
           <w:sz w:val="21"/>
           <w:szCs w:val="21"/>
         </w:rPr>
-        <w:t xml:space="preserve">La pantalla de vencimientos muestra por defecto las próximas dos semanas, con un plazo configurable, y solo permite descargar recibos de operaciones efectivamente cobradas. En la pantalla de líneas, las operaciones de cada línea se muestran ordenadas desde el primer vencimiento hasta el más futuro, con su tasa de operación, su tasa de fondeo, su vencimiento final y su plazo. En el tablero de oficiales, los cheques, rescates, transferencias y liquidaciones pendientes se muestran para decidir, pero no liberan fondos de forma automática. Las tablas de amortización solo pueden modificarse en préstamos liquidados y activos, sobre las cuotas no cobradas, con la adenda adjunta y con la aprobación de Activas. Por último, en todo el circuito, cada aprobación, cada forzado y cada cambio de tasa queda registrado con usuario y fecha.</w:t>
+        <w:t xml:space="preserve">La pantalla de vencimientos muestra por defecto las próximas dos semanas, con un plazo configurable, y solo permite descargar recibos de operaciones efectivamente cobradas. Desde el consumido de cada subproducto en la pantalla de líneas se accede a la visión consolidada del cliente, filtrada por ese subproducto, con las operaciones concertadas ordenadas desde la que vence primero hasta la última. En el tablero de oficiales, los cheques, rescates, transferencias y liquidaciones pendientes se muestran para decidir, pero no liberan fondos de forma automática. Las tablas de amortización solo pueden modificarse en préstamos liquidados y activos, sobre las cuotas no cobradas, con la adenda adjunta y con la aprobación de Activas. Por último, en todo el circuito, cada aprobación, cada forzado y cada cambio de tasa queda registrado con usuario y fecha.</w:t>
       </w:r>
     </w:p>
     <w:p>

</xml_diff>

<commit_message>
Validar plazo por operación según la minuta, parametrizar montos de comité y reemplazo de aprobadores
Co-Authored-By: Claude Opus 5.5 <noreply@anthropic.com>
Claude-Session: https://claude.ai/code/session_01JR48ZtjHAJWp3RfTGUyHxs
</commit_message>
<xml_diff>
--- a/Informe_Nueva_Aplicacion_Gestion_Middle_Office.docx
+++ b/Informe_Nueva_Aplicacion_Gestion_Middle_Office.docx
@@ -1030,7 +1030,7 @@
           <w:sz w:val="21"/>
           <w:szCs w:val="21"/>
         </w:rPr>
-        <w:t xml:space="preserve">La minuta digital reúne los mismos datos que la actual, más los que necesita el nuevo circuito. Riesgos carga el CUIT y la razón social del cliente, que son obligatorios; con el CUIT, el sistema busca el grupo económico en COBIS MIS y, si no lo encuentra, marca al cliente para un alta simplificada. Además, el sistema consulta Nosis y verifica que la situación del cliente sea 1. El oficial de la cuenta también es obligatorio, porque define qué gerente comercial interviene en la aprobación. Si el cliente ya tiene una línea, el sistema trae la línea presente desde COBIS. Riesgos completa la línea propuesta, con su monto, su moneda, sus subproductos y su plazo; el rating crediticio, la situación según el BCRA y la fecha de revisión; y las garantías, indicando qué subproductos las requieren, de qué tipo y si la línea se garantiza con avales. Con esa información, el sistema sugiere si la minuta debe ir al comité de los martes o al subcomité de los viernes.</w:t>
+        <w:t xml:space="preserve">La minuta digital reúne los mismos datos que la actual, más los que necesita el nuevo circuito. Riesgos carga el CUIT y la razón social del cliente, que son obligatorios; con el CUIT, el sistema busca el grupo económico en COBIS MIS y, si no lo encuentra, marca al cliente para un alta simplificada. Además, el sistema consulta Nosis y verifica que la situación del cliente sea 1. El oficial de la cuenta también es obligatorio, porque define qué gerente comercial interviene en la aprobación. Si el cliente ya tiene una línea, el sistema trae la línea presente desde COBIS. Riesgos completa la línea propuesta, con su monto, su moneda, sus subproductos y el plazo máximo de cada operación; el rating crediticio, la situación según el BCRA y la fecha de revisión; y las garantías, indicando qué subproductos las requieren, de qué tipo y si la línea se garantiza con avales. Con esa información, el sistema sugiere si la minuta debe ir al comité de los martes o al subcomité de los viernes.</w:t>
       </w:r>
     </w:p>
     <w:p>
@@ -1126,6 +1126,45 @@
           <w:szCs w:val="21"/>
         </w:rPr>
         <w:t xml:space="preserve">Esta lista de acciones es una propuesta inicial, armada a partir del relevamiento, y debe confirmarse con Riesgos, Middle Office y Red BI.</w:t>
+      </w:r>
+    </w:p>
+    <w:p>
+      <w:pPr>
+        <w:pStyle w:val="Heading3"/>
+      </w:pPr>
+      <w:r>
+        <w:rPr>
+          <w:rFonts w:ascii="Calibri" w:cs="Calibri" w:eastAsia="Calibri" w:hAnsi="Calibri"/>
+        </w:rPr>
+        <w:t xml:space="preserve">Parámetros de aprobación y reemplazos</w:t>
+      </w:r>
+    </w:p>
+    <w:p>
+      <w:pPr>
+        <w:spacing w:after="120"/>
+        <w:jc w:val="both"/>
+      </w:pPr>
+      <w:r>
+        <w:rPr>
+          <w:rFonts w:ascii="Calibri" w:cs="Calibri" w:eastAsia="Calibri" w:hAnsi="Calibri"/>
+          <w:sz w:val="21"/>
+          <w:szCs w:val="21"/>
+        </w:rPr>
+        <w:t xml:space="preserve">Los montos que definen si una línea va al comité o al subcomité no quedan fijos en el sistema. Una pantalla de parámetros permite cambiar los importes de comité y subcomité el día que se modifiquen: se cargan los nuevos montos con su fecha de vigencia, las minutas toman los montos vigentes a su fecha para sugerir la instancia, y queda el historial de quién los cambió, cuándo y desde qué fecha rigen.</w:t>
+      </w:r>
+    </w:p>
+    <w:p>
+      <w:pPr>
+        <w:spacing w:after="120"/>
+        <w:jc w:val="both"/>
+      </w:pPr>
+      <w:r>
+        <w:rPr>
+          <w:rFonts w:ascii="Calibri" w:cs="Calibri" w:eastAsia="Calibri" w:hAnsi="Calibri"/>
+          <w:sz w:val="21"/>
+          <w:szCs w:val="21"/>
+        </w:rPr>
+        <w:t xml:space="preserve">El sistema contempla además el reemplazo de los aprobadores. Cuando el gerente comercial, el gerente de Riesgos o el CEO no están, se puede designar un suplente con un período de vigencia; durante ese período las aprobaciones se rutean al suplente, y cada aprobación queda registrada a su nombre, indicando a quién reemplaza. Queda por definir quién puede modificar los montos y quién designa los reemplazos.</w:t>
       </w:r>
     </w:p>
     <w:p>
@@ -1522,7 +1561,7 @@
           <w:sz w:val="21"/>
           <w:szCs w:val="21"/>
         </w:rPr>
-        <w:t xml:space="preserve">Luego el sistema asocia el costo de fondeo según el plazo máximo del acuerdo y valida que la tasa sea superior a la tasa mínima de Mesa, algo que hoy no se controla. También controla automáticamente el fraccionamiento, que hoy revisa a mano un analista de Riesgos: verifica que la suma de las operaciones del grupo no supere la línea y que el grupo no supere el 15% de la RPC del banco. Si el acuerdo lleva garantía, se carga la garantía, pasa a la conformidad de Activas y, una vez aprobada, se dan de alta juntas la garantía y el acuerdo.</w:t>
+        <w:t xml:space="preserve">Luego el sistema verifica que el plazo del acuerdo no supere el aprobado en la minuta para ese subproducto y ese cliente, asocia el costo de fondeo según el plazo máximo del acuerdo y valida que la tasa sea superior a la tasa mínima de Mesa, algo que hoy no se controla. También controla automáticamente el fraccionamiento, que hoy revisa a mano un analista de Riesgos: verifica que la suma de las operaciones del grupo no supere la línea y que el grupo no supere el 15% de la RPC del banco. Si el acuerdo lleva garantía, se carga la garantía, pasa a la conformidad de Activas y, una vez aprobada, se dan de alta juntas la garantía y el acuerdo.</w:t>
       </w:r>
     </w:p>
     <w:p>
@@ -1589,7 +1628,7 @@
           <w:sz w:val="21"/>
           <w:szCs w:val="21"/>
         </w:rPr>
-        <w:t xml:space="preserve">Antes del alta, el sistema asocia el costo de fondeo según el plazo máximo del préstamo y valida que la tasa supere la mínima de Mesa, que haya línea disponible y que no se exceda el 15% de la RPC del grupo. Una vez dado de alta, las cuotas del préstamo aparecen en la pantalla de vencimientos con su estado.</w:t>
+        <w:t xml:space="preserve">Antes del alta, el sistema verifica que el plazo del préstamo no supere el aprobado en la minuta para ese subproducto y ese cliente, asocia el costo de fondeo según el plazo máximo del préstamo y valida que la tasa supere la mínima de Mesa, que haya línea disponible y que no se exceda el 15% de la RPC del grupo. Una vez dado de alta, las cuotas del préstamo aparecen en la pantalla de vencimientos con su estado.</w:t>
       </w:r>
     </w:p>
     <w:p>
@@ -2235,7 +2274,7 @@
           <w:sz w:val="21"/>
           <w:szCs w:val="21"/>
         </w:rPr>
-        <w:t xml:space="preserve">La minuta no se puede aprobar sin oficial y CUIT. Su aprobación dispara las acciones automáticas, y si alguna falla, queda pendiente y visible para que se resuelva. El aprobador comercial se determina según el oficial de la minuta. La instancia de aprobación depende de la línea: van al subcomité las líneas de hasta USD 1.000.000, las corporativas de hasta $1.000 millones y las de ALyC; el resto va al comité.</w:t>
+        <w:t xml:space="preserve">La minuta no se puede aprobar sin oficial y CUIT. Su aprobación dispara las acciones automáticas, y si alguna falla, queda pendiente y visible para que se resuelva. El aprobador comercial se determina según el oficial de la minuta. La instancia de aprobación depende de la línea y de los montos parametrizados vigentes: hoy van al subcomité las líneas de hasta USD 1.000.000, las corporativas de hasta $1.000 millones y las de ALyC, y el resto va al comité. Si un aprobador tiene un suplente vigente, la aprobación se rutea al suplente y queda registrada a su nombre.</w:t>
       </w:r>
     </w:p>
     <w:p>
@@ -2274,7 +2313,7 @@
           <w:sz w:val="21"/>
           <w:szCs w:val="21"/>
         </w:rPr>
-        <w:t xml:space="preserve">Toda operación se inicia desde una línea vigente en la pantalla de líneas, salvo las renovaciones, que se inician desde la pantalla de vencimientos. En cada operación, la suma de las operaciones del grupo no puede superar la línea aprobada y ningún grupo puede superar el 15% de la RPC del banco, calculada según la normativa del BCRA sobre grandes exposiciones al riesgo de crédito (punto 2.1). Cada operación, al cargarse o renovarse, queda asociada al costo de fondeo del plazo máximo otorgado, y su tasa debe ser superior a la tasa mínima cargada por Mesa. Cuando una operación lleva garantía, su alta queda condicionada a la conformidad de Activas.</w:t>
+        <w:t xml:space="preserve">Como la minuta fija el plazo máximo de cada operación, ninguna operación puede otorgarse a un cliente por un plazo mayor al aprobado para ese subproducto. Toda operación se inicia desde una línea vigente en la pantalla de líneas, salvo las renovaciones, que se inician desde la pantalla de vencimientos. En cada operación, la suma de las operaciones del grupo no puede superar la línea aprobada y ningún grupo puede superar el 15% de la RPC del banco, calculada según la normativa del BCRA sobre grandes exposiciones al riesgo de crédito (punto 2.1). Cada operación, al cargarse o renovarse, queda asociada al costo de fondeo del plazo máximo otorgado, y su tasa debe ser superior a la tasa mínima cargada por Mesa. Cuando una operación lleva garantía, su alta queda condicionada a la conformidad de Activas.</w:t>
       </w:r>
     </w:p>
     <w:p>
@@ -2706,7 +2745,7 @@
           <w:sz w:val="21"/>
           <w:szCs w:val="21"/>
         </w:rPr>
-        <w:t xml:space="preserve">También deben definirse los criterios y la auditoría del forzado de alta por parte del gerente de Riesgos o el CEO; y el alcance de la definición de que "todo lo que está en Trámites y Gestión pase por COBIS Web", para confirmar si incluye otros productos. Queda por revisar si un cliente con límite disponible aprobado puede operar hasta ese límite sin pedir un acuerdo adicional por cada pago, considerando las restricciones de riesgo, previsiones, capital y normativa, y cómo se definen los permisos de los oficiales sobre carteras ajenas.</w:t>
+        <w:t xml:space="preserve">También deben definirse los criterios y la auditoría del forzado de alta por parte del gerente de Riesgos o el CEO; y el alcance de la definición de que "todo lo que está en Trámites y Gestión pase por COBIS Web", para confirmar si incluye otros productos. Queda por revisar si un cliente con límite disponible aprobado puede operar hasta ese límite sin pedir un acuerdo adicional por cada pago, considerando las restricciones de riesgo, previsiones, capital y normativa, cómo se definen los permisos de los oficiales sobre carteras ajenas, y quién puede modificar los montos de comité y subcomité y designar los reemplazos de los aprobadores.</w:t>
       </w:r>
     </w:p>
     <w:p>

</xml_diff>